<commit_message>
Update Pertemuan 6 Word
</commit_message>
<xml_diff>
--- a/Tugas Teori/Pertemuan 6/Pertemuan6_11.docx
+++ b/Tugas Teori/Pertemuan 6/Pertemuan6_11.docx
@@ -178,14 +178,12 @@
                 <w:rFonts w:ascii="Arial" w:hAnsi="Arial" w:cs="Arial"/>
               </w:rPr>
             </w:pPr>
-            <w:proofErr w:type="spellStart"/>
             <w:r>
               <w:rPr>
                 <w:rFonts w:ascii="Arial" w:hAnsi="Arial" w:cs="Arial"/>
               </w:rPr>
               <w:t>Kelas</w:t>
             </w:r>
-            <w:proofErr w:type="spellEnd"/>
           </w:p>
         </w:tc>
         <w:tc>
@@ -320,40 +318,17 @@
             </w:r>
           </w:p>
           <w:p>
-            <w:proofErr w:type="spellStart"/>
-            <w:r>
-              <w:t>Deklarasi</w:t>
-            </w:r>
-            <w:proofErr w:type="spellEnd"/>
-            <w:r>
-              <w:t>:</w:t>
+            <w:r>
+              <w:t>Deklarasi:</w:t>
             </w:r>
             <w:r>
               <w:br/>
-              <w:t xml:space="preserve">    bil1, bil2, bil3, </w:t>
-            </w:r>
-            <w:proofErr w:type="spellStart"/>
-            <w:proofErr w:type="gramStart"/>
-            <w:r>
-              <w:t>maks</w:t>
-            </w:r>
-            <w:proofErr w:type="spellEnd"/>
-            <w:r>
-              <w:t xml:space="preserve"> :</w:t>
-            </w:r>
-            <w:proofErr w:type="gramEnd"/>
-            <w:r>
-              <w:t xml:space="preserve"> Integer</w:t>
-            </w:r>
-          </w:p>
-          <w:p>
-            <w:proofErr w:type="spellStart"/>
-            <w:r>
-              <w:t>Algoritma</w:t>
-            </w:r>
-            <w:proofErr w:type="spellEnd"/>
-            <w:r>
-              <w:t>:</w:t>
+              <w:t xml:space="preserve">    bil1, bil2, bil3, maks : Integer</w:t>
+            </w:r>
+          </w:p>
+          <w:p>
+            <w:r>
+              <w:t>Algoritma:</w:t>
             </w:r>
             <w:r>
               <w:br/>
@@ -380,15 +355,7 @@
           </w:p>
           <w:p>
             <w:r>
-              <w:t xml:space="preserve">            </w:t>
-            </w:r>
-            <w:proofErr w:type="spellStart"/>
-            <w:r>
-              <w:t>maks</w:t>
-            </w:r>
-            <w:proofErr w:type="spellEnd"/>
-            <w:r>
-              <w:t xml:space="preserve"> &lt;- bil1</w:t>
+              <w:t xml:space="preserve">            maks &lt;- bil1</w:t>
             </w:r>
           </w:p>
           <w:p>
@@ -398,15 +365,7 @@
           </w:p>
           <w:p>
             <w:r>
-              <w:t xml:space="preserve">            </w:t>
-            </w:r>
-            <w:proofErr w:type="spellStart"/>
-            <w:r>
-              <w:t>maks</w:t>
-            </w:r>
-            <w:proofErr w:type="spellEnd"/>
-            <w:r>
-              <w:t xml:space="preserve"> &lt;- bil3</w:t>
+              <w:t xml:space="preserve">            maks &lt;- bil3</w:t>
             </w:r>
           </w:p>
           <w:p>
@@ -426,15 +385,7 @@
           </w:p>
           <w:p>
             <w:r>
-              <w:t xml:space="preserve">            </w:t>
-            </w:r>
-            <w:proofErr w:type="spellStart"/>
-            <w:r>
-              <w:t>maks</w:t>
-            </w:r>
-            <w:proofErr w:type="spellEnd"/>
-            <w:r>
-              <w:t xml:space="preserve"> &lt;- bil2</w:t>
+              <w:t xml:space="preserve">            maks &lt;- bil2</w:t>
             </w:r>
           </w:p>
           <w:p>
@@ -444,15 +395,7 @@
           </w:p>
           <w:p>
             <w:r>
-              <w:t xml:space="preserve">            </w:t>
-            </w:r>
-            <w:proofErr w:type="spellStart"/>
-            <w:r>
-              <w:t>maks</w:t>
-            </w:r>
-            <w:proofErr w:type="spellEnd"/>
-            <w:r>
-              <w:t xml:space="preserve"> &lt;- bil3</w:t>
+              <w:t xml:space="preserve">            maks &lt;- bil3</w:t>
             </w:r>
           </w:p>
           <w:p>
@@ -468,34 +411,8 @@
           <w:p/>
           <w:p>
             <w:r>
-              <w:t xml:space="preserve">    Output "</w:t>
-            </w:r>
-            <w:proofErr w:type="spellStart"/>
-            <w:r>
-              <w:t>bilangan</w:t>
-            </w:r>
-            <w:proofErr w:type="spellEnd"/>
-            <w:r>
-              <w:t xml:space="preserve"> </w:t>
-            </w:r>
-            <w:proofErr w:type="spellStart"/>
-            <w:proofErr w:type="gramStart"/>
-            <w:r>
-              <w:t>terbesar</w:t>
-            </w:r>
-            <w:proofErr w:type="spellEnd"/>
-            <w:r>
-              <w:t xml:space="preserve"> :</w:t>
-            </w:r>
-            <w:proofErr w:type="gramEnd"/>
-            <w:r>
-              <w:t xml:space="preserve"> ", </w:t>
-            </w:r>
-            <w:proofErr w:type="spellStart"/>
-            <w:r>
-              <w:t>maks</w:t>
-            </w:r>
-            <w:proofErr w:type="spellEnd"/>
+              <w:t xml:space="preserve">    Output "bilangan terbesar : ", maks</w:t>
+            </w:r>
           </w:p>
           <w:p/>
         </w:tc>
@@ -687,20 +604,7 @@
           </w:tcPr>
           <w:p>
             <w:r>
-              <w:t xml:space="preserve">import </w:t>
-            </w:r>
-            <w:proofErr w:type="spellStart"/>
-            <w:proofErr w:type="gramStart"/>
-            <w:r>
-              <w:t>java.util</w:t>
-            </w:r>
-            <w:proofErr w:type="gramEnd"/>
-            <w:r>
-              <w:t>.Scanner</w:t>
-            </w:r>
-            <w:proofErr w:type="spellEnd"/>
-            <w:r>
-              <w:t>;</w:t>
+              <w:t>import java.util.Scanner;</w:t>
             </w:r>
           </w:p>
           <w:p/>
@@ -711,349 +615,79 @@
           </w:p>
           <w:p>
             <w:r>
-              <w:t xml:space="preserve">    public static void </w:t>
-            </w:r>
-            <w:proofErr w:type="gramStart"/>
-            <w:r>
-              <w:t>main(String[</w:t>
-            </w:r>
-            <w:proofErr w:type="gramEnd"/>
-            <w:r>
-              <w:t xml:space="preserve">] </w:t>
-            </w:r>
-            <w:proofErr w:type="spellStart"/>
-            <w:r>
-              <w:t>args</w:t>
-            </w:r>
-            <w:proofErr w:type="spellEnd"/>
-            <w:r>
-              <w:t>) {</w:t>
-            </w:r>
-          </w:p>
-          <w:p>
-            <w:r>
-              <w:t xml:space="preserve">        Scanner </w:t>
-            </w:r>
-            <w:proofErr w:type="spellStart"/>
-            <w:r>
-              <w:t>sc</w:t>
-            </w:r>
-            <w:proofErr w:type="spellEnd"/>
-            <w:r>
-              <w:t xml:space="preserve"> = new </w:t>
-            </w:r>
-            <w:proofErr w:type="gramStart"/>
-            <w:r>
-              <w:t>Scanner(</w:t>
-            </w:r>
-            <w:proofErr w:type="gramEnd"/>
-            <w:r>
-              <w:t>System.in);</w:t>
-            </w:r>
-          </w:p>
-          <w:p>
-            <w:r>
-              <w:t xml:space="preserve">        </w:t>
-            </w:r>
-            <w:proofErr w:type="spellStart"/>
-            <w:r>
-              <w:t>System.out.println</w:t>
-            </w:r>
-            <w:proofErr w:type="spellEnd"/>
-            <w:r>
-              <w:t xml:space="preserve">("Masukkan </w:t>
-            </w:r>
-            <w:proofErr w:type="spellStart"/>
-            <w:r>
-              <w:t>hari</w:t>
-            </w:r>
-            <w:proofErr w:type="spellEnd"/>
-            <w:r>
-              <w:t>");</w:t>
-            </w:r>
-          </w:p>
-          <w:p>
-            <w:r>
-              <w:t xml:space="preserve">        String </w:t>
-            </w:r>
-            <w:proofErr w:type="spellStart"/>
-            <w:r>
-              <w:t>hari</w:t>
-            </w:r>
-            <w:proofErr w:type="spellEnd"/>
-            <w:r>
-              <w:t xml:space="preserve"> = </w:t>
-            </w:r>
-            <w:proofErr w:type="spellStart"/>
-            <w:proofErr w:type="gramStart"/>
-            <w:r>
-              <w:t>sc.nextLine</w:t>
-            </w:r>
-            <w:proofErr w:type="spellEnd"/>
-            <w:proofErr w:type="gramEnd"/>
-            <w:r>
-              <w:t>(</w:t>
-            </w:r>
-            <w:proofErr w:type="gramStart"/>
-            <w:r>
-              <w:t>).</w:t>
-            </w:r>
-            <w:proofErr w:type="spellStart"/>
-            <w:r>
-              <w:t>toLowerCase</w:t>
-            </w:r>
-            <w:proofErr w:type="spellEnd"/>
-            <w:proofErr w:type="gramEnd"/>
-            <w:r>
-              <w:t>();</w:t>
-            </w:r>
-          </w:p>
-          <w:p>
-            <w:r>
-              <w:t xml:space="preserve">        </w:t>
-            </w:r>
-            <w:proofErr w:type="spellStart"/>
-            <w:r>
-              <w:t>System.out.println</w:t>
-            </w:r>
-            <w:proofErr w:type="spellEnd"/>
-            <w:r>
-              <w:t xml:space="preserve">("Masukkan </w:t>
-            </w:r>
-            <w:proofErr w:type="spellStart"/>
-            <w:r>
-              <w:t>jenis</w:t>
-            </w:r>
-            <w:proofErr w:type="spellEnd"/>
-            <w:r>
-              <w:t xml:space="preserve"> </w:t>
-            </w:r>
-            <w:proofErr w:type="spellStart"/>
-            <w:r>
-              <w:t>buku</w:t>
-            </w:r>
-            <w:proofErr w:type="spellEnd"/>
-            <w:r>
-              <w:t>");</w:t>
-            </w:r>
-          </w:p>
-          <w:p>
-            <w:r>
-              <w:t xml:space="preserve">        String </w:t>
-            </w:r>
-            <w:proofErr w:type="spellStart"/>
-            <w:r>
-              <w:t>jenis</w:t>
-            </w:r>
-            <w:proofErr w:type="spellEnd"/>
-            <w:r>
-              <w:t xml:space="preserve"> = </w:t>
-            </w:r>
-            <w:proofErr w:type="spellStart"/>
-            <w:proofErr w:type="gramStart"/>
-            <w:r>
-              <w:t>sc.nextLine</w:t>
-            </w:r>
-            <w:proofErr w:type="spellEnd"/>
-            <w:proofErr w:type="gramEnd"/>
-            <w:r>
-              <w:t>(</w:t>
-            </w:r>
-            <w:proofErr w:type="gramStart"/>
-            <w:r>
-              <w:t>).</w:t>
-            </w:r>
-            <w:proofErr w:type="spellStart"/>
-            <w:r>
-              <w:t>toLowerCase</w:t>
-            </w:r>
-            <w:proofErr w:type="spellEnd"/>
-            <w:proofErr w:type="gramEnd"/>
-            <w:r>
-              <w:t>();</w:t>
-            </w:r>
-          </w:p>
-          <w:p>
-            <w:r>
-              <w:t xml:space="preserve">        </w:t>
-            </w:r>
-            <w:proofErr w:type="spellStart"/>
-            <w:r>
-              <w:t>System.out.println</w:t>
-            </w:r>
-            <w:proofErr w:type="spellEnd"/>
-            <w:r>
-              <w:t xml:space="preserve">("Masukkan </w:t>
-            </w:r>
-            <w:proofErr w:type="spellStart"/>
-            <w:r>
-              <w:t>harga</w:t>
-            </w:r>
-            <w:proofErr w:type="spellEnd"/>
-            <w:r>
-              <w:t xml:space="preserve"> per </w:t>
-            </w:r>
-            <w:proofErr w:type="spellStart"/>
-            <w:r>
-              <w:t>buku</w:t>
-            </w:r>
-            <w:proofErr w:type="spellEnd"/>
-            <w:r>
-              <w:t>");</w:t>
-            </w:r>
-          </w:p>
-          <w:p>
-            <w:r>
-              <w:t xml:space="preserve">        double </w:t>
-            </w:r>
-            <w:proofErr w:type="spellStart"/>
-            <w:r>
-              <w:t>harga</w:t>
-            </w:r>
-            <w:proofErr w:type="spellEnd"/>
-            <w:r>
-              <w:t xml:space="preserve"> = </w:t>
-            </w:r>
-            <w:proofErr w:type="spellStart"/>
-            <w:proofErr w:type="gramStart"/>
-            <w:r>
-              <w:t>sc.nextDouble</w:t>
-            </w:r>
-            <w:proofErr w:type="spellEnd"/>
-            <w:proofErr w:type="gramEnd"/>
-            <w:r>
-              <w:t>();</w:t>
-            </w:r>
-          </w:p>
-          <w:p>
-            <w:r>
-              <w:t xml:space="preserve">        </w:t>
-            </w:r>
-            <w:proofErr w:type="spellStart"/>
-            <w:r>
-              <w:t>System.out.println</w:t>
-            </w:r>
-            <w:proofErr w:type="spellEnd"/>
-            <w:r>
-              <w:t xml:space="preserve">("Masukkan </w:t>
-            </w:r>
-            <w:proofErr w:type="spellStart"/>
-            <w:r>
-              <w:t>jumlah</w:t>
-            </w:r>
-            <w:proofErr w:type="spellEnd"/>
-            <w:r>
-              <w:t xml:space="preserve"> </w:t>
-            </w:r>
-            <w:proofErr w:type="spellStart"/>
-            <w:r>
-              <w:t>buku</w:t>
-            </w:r>
-            <w:proofErr w:type="spellEnd"/>
-            <w:r>
-              <w:t>");</w:t>
-            </w:r>
-          </w:p>
-          <w:p>
-            <w:r>
-              <w:t xml:space="preserve">        int </w:t>
-            </w:r>
-            <w:proofErr w:type="spellStart"/>
-            <w:r>
-              <w:t>jumlahBuku</w:t>
-            </w:r>
-            <w:proofErr w:type="spellEnd"/>
-            <w:r>
-              <w:t xml:space="preserve"> = </w:t>
-            </w:r>
-            <w:proofErr w:type="spellStart"/>
-            <w:proofErr w:type="gramStart"/>
-            <w:r>
-              <w:t>sc.nextInt</w:t>
-            </w:r>
-            <w:proofErr w:type="spellEnd"/>
-            <w:proofErr w:type="gramEnd"/>
-            <w:r>
-              <w:t>();</w:t>
+              <w:t>    public static void main(String[] args) {</w:t>
+            </w:r>
+          </w:p>
+          <w:p>
+            <w:r>
+              <w:t>        Scanner sc = new Scanner(System.in);</w:t>
+            </w:r>
+          </w:p>
+          <w:p>
+            <w:r>
+              <w:t>        System.out.println("Masukkan hari");</w:t>
+            </w:r>
+          </w:p>
+          <w:p>
+            <w:r>
+              <w:t>        String hari = sc.nextLine().toLowerCase();</w:t>
+            </w:r>
+          </w:p>
+          <w:p>
+            <w:r>
+              <w:t>        System.out.println("Masukkan jenis buku");</w:t>
+            </w:r>
+          </w:p>
+          <w:p>
+            <w:r>
+              <w:t>        String jenis = sc.nextLine().toLowerCase();</w:t>
+            </w:r>
+          </w:p>
+          <w:p>
+            <w:r>
+              <w:t>        System.out.println("Masukkan harga per buku");</w:t>
+            </w:r>
+          </w:p>
+          <w:p>
+            <w:r>
+              <w:t>        double harga = sc.nextDouble();</w:t>
+            </w:r>
+          </w:p>
+          <w:p>
+            <w:r>
+              <w:t>        System.out.println("Masukkan jumlah buku");</w:t>
+            </w:r>
+          </w:p>
+          <w:p>
+            <w:r>
+              <w:t>        int jumlahBuku = sc.nextInt();</w:t>
             </w:r>
           </w:p>
           <w:p/>
           <w:p>
             <w:r>
-              <w:t xml:space="preserve">        int </w:t>
-            </w:r>
-            <w:proofErr w:type="spellStart"/>
-            <w:r>
-              <w:t>diskon</w:t>
-            </w:r>
-            <w:proofErr w:type="spellEnd"/>
-            <w:r>
-              <w:t xml:space="preserve"> = 0;</w:t>
+              <w:t>        int diskon = 0;</w:t>
             </w:r>
           </w:p>
           <w:p/>
           <w:p>
             <w:r>
-              <w:t>        if (</w:t>
-            </w:r>
-            <w:proofErr w:type="spellStart"/>
-            <w:proofErr w:type="gramStart"/>
-            <w:r>
-              <w:t>hari.equals</w:t>
-            </w:r>
-            <w:proofErr w:type="spellEnd"/>
-            <w:proofErr w:type="gramEnd"/>
-            <w:r>
-              <w:t>("</w:t>
-            </w:r>
-            <w:proofErr w:type="spellStart"/>
-            <w:r>
-              <w:t>rabu</w:t>
-            </w:r>
-            <w:proofErr w:type="spellEnd"/>
-            <w:r>
-              <w:t>")) {</w:t>
-            </w:r>
-          </w:p>
-          <w:p>
-            <w:r>
-              <w:t>            if (</w:t>
-            </w:r>
-            <w:proofErr w:type="spellStart"/>
-            <w:proofErr w:type="gramStart"/>
-            <w:r>
-              <w:t>jenis.equals</w:t>
-            </w:r>
-            <w:proofErr w:type="spellEnd"/>
-            <w:proofErr w:type="gramEnd"/>
-            <w:r>
-              <w:t>("novel")) {</w:t>
-            </w:r>
-          </w:p>
-          <w:p>
-            <w:r>
-              <w:t>                if (</w:t>
-            </w:r>
-            <w:proofErr w:type="spellStart"/>
-            <w:r>
-              <w:t>jumlahBuku</w:t>
-            </w:r>
-            <w:proofErr w:type="spellEnd"/>
-            <w:r>
-              <w:t xml:space="preserve"> &gt; 3) {</w:t>
-            </w:r>
-          </w:p>
-          <w:p>
-            <w:r>
-              <w:t xml:space="preserve">                    </w:t>
-            </w:r>
-            <w:proofErr w:type="spellStart"/>
-            <w:r>
-              <w:t>diskon</w:t>
-            </w:r>
-            <w:proofErr w:type="spellEnd"/>
-            <w:r>
-              <w:t xml:space="preserve"> = 9;</w:t>
+              <w:t>        if (hari.equals("rabu")) {</w:t>
+            </w:r>
+          </w:p>
+          <w:p>
+            <w:r>
+              <w:t>            if (jenis.equals("novel")) {</w:t>
+            </w:r>
+          </w:p>
+          <w:p>
+            <w:r>
+              <w:t>                if (jumlahBuku &gt; 3) {</w:t>
+            </w:r>
+          </w:p>
+          <w:p>
+            <w:r>
+              <w:t>                    diskon = 9;</w:t>
             </w:r>
           </w:p>
           <w:p>
@@ -1063,15 +697,7 @@
           </w:p>
           <w:p>
             <w:r>
-              <w:t xml:space="preserve">                    </w:t>
-            </w:r>
-            <w:proofErr w:type="spellStart"/>
-            <w:r>
-              <w:t>diskon</w:t>
-            </w:r>
-            <w:proofErr w:type="spellEnd"/>
-            <w:r>
-              <w:t xml:space="preserve"> = 8;</w:t>
+              <w:t>                    diskon = 8;</w:t>
             </w:r>
           </w:p>
           <w:p>
@@ -1086,15 +712,7 @@
           </w:p>
           <w:p>
             <w:r>
-              <w:t xml:space="preserve">                    </w:t>
-            </w:r>
-            <w:proofErr w:type="spellStart"/>
-            <w:r>
-              <w:t>diskon</w:t>
-            </w:r>
-            <w:proofErr w:type="spellEnd"/>
-            <w:r>
-              <w:t xml:space="preserve"> = 8;</w:t>
+              <w:t>                    diskon = 8;</w:t>
             </w:r>
           </w:p>
           <w:p>
@@ -1104,51 +722,17 @@
           </w:p>
           <w:p>
             <w:r>
-              <w:t>            } else if (</w:t>
-            </w:r>
-            <w:proofErr w:type="spellStart"/>
-            <w:proofErr w:type="gramStart"/>
-            <w:r>
-              <w:t>jenis.equals</w:t>
-            </w:r>
-            <w:proofErr w:type="spellEnd"/>
-            <w:proofErr w:type="gramEnd"/>
-            <w:r>
-              <w:t>("</w:t>
-            </w:r>
-            <w:proofErr w:type="spellStart"/>
-            <w:r>
-              <w:t>kamus</w:t>
-            </w:r>
-            <w:proofErr w:type="spellEnd"/>
-            <w:r>
-              <w:t>")) {</w:t>
-            </w:r>
-          </w:p>
-          <w:p>
-            <w:r>
-              <w:t>                if (</w:t>
-            </w:r>
-            <w:proofErr w:type="spellStart"/>
-            <w:r>
-              <w:t>jumlahBuku</w:t>
-            </w:r>
-            <w:proofErr w:type="spellEnd"/>
-            <w:r>
-              <w:t xml:space="preserve"> &gt; 2) {</w:t>
-            </w:r>
-          </w:p>
-          <w:p>
-            <w:r>
-              <w:t xml:space="preserve">                    </w:t>
-            </w:r>
-            <w:proofErr w:type="spellStart"/>
-            <w:r>
-              <w:t>diskon</w:t>
-            </w:r>
-            <w:proofErr w:type="spellEnd"/>
-            <w:r>
-              <w:t xml:space="preserve"> = 12;</w:t>
+              <w:t>            } else if (jenis.equals("kamus")) {</w:t>
+            </w:r>
+          </w:p>
+          <w:p>
+            <w:r>
+              <w:t>                if (jumlahBuku &gt; 2) {</w:t>
+            </w:r>
+          </w:p>
+          <w:p>
+            <w:r>
+              <w:t>                    diskon = 12;</w:t>
             </w:r>
           </w:p>
           <w:p>
@@ -1158,15 +742,7 @@
           </w:p>
           <w:p>
             <w:r>
-              <w:t xml:space="preserve">                    </w:t>
-            </w:r>
-            <w:proofErr w:type="spellStart"/>
-            <w:r>
-              <w:t>diskon</w:t>
-            </w:r>
-            <w:proofErr w:type="spellEnd"/>
-            <w:r>
-              <w:t xml:space="preserve"> = 10;</w:t>
+              <w:t>                    diskon = 10;</w:t>
             </w:r>
           </w:p>
           <w:p>
@@ -1181,28 +757,12 @@
           </w:p>
           <w:p>
             <w:r>
-              <w:t>                if (</w:t>
-            </w:r>
-            <w:proofErr w:type="spellStart"/>
-            <w:r>
-              <w:t>jumlahBuku</w:t>
-            </w:r>
-            <w:proofErr w:type="spellEnd"/>
-            <w:r>
-              <w:t xml:space="preserve"> &gt; 3) {</w:t>
-            </w:r>
-          </w:p>
-          <w:p>
-            <w:r>
-              <w:t xml:space="preserve">                    </w:t>
-            </w:r>
-            <w:proofErr w:type="spellStart"/>
-            <w:r>
-              <w:t>diskon</w:t>
-            </w:r>
-            <w:proofErr w:type="spellEnd"/>
-            <w:r>
-              <w:t xml:space="preserve"> = 5;</w:t>
+              <w:t>                if (jumlahBuku &gt; 3) {</w:t>
+            </w:r>
+          </w:p>
+          <w:p>
+            <w:r>
+              <w:t>                    diskon = 5;</w:t>
             </w:r>
           </w:p>
           <w:p>
@@ -1212,15 +772,7 @@
           </w:p>
           <w:p>
             <w:r>
-              <w:t xml:space="preserve">                    </w:t>
-            </w:r>
-            <w:proofErr w:type="spellStart"/>
-            <w:r>
-              <w:t>diskon</w:t>
-            </w:r>
-            <w:proofErr w:type="spellEnd"/>
-            <w:r>
-              <w:t xml:space="preserve"> = 0;</w:t>
+              <w:t>                    diskon = 0;</w:t>
             </w:r>
           </w:p>
           <w:p>
@@ -1236,191 +788,40 @@
           <w:p/>
           <w:p>
             <w:r>
-              <w:t xml:space="preserve">        double total = </w:t>
-            </w:r>
-            <w:proofErr w:type="spellStart"/>
-            <w:r>
-              <w:t>harga</w:t>
-            </w:r>
-            <w:proofErr w:type="spellEnd"/>
-            <w:r>
-              <w:t xml:space="preserve"> * </w:t>
-            </w:r>
-            <w:proofErr w:type="spellStart"/>
-            <w:r>
-              <w:t>jumlahBuku</w:t>
-            </w:r>
-            <w:proofErr w:type="spellEnd"/>
-            <w:r>
-              <w:t>;</w:t>
+              <w:t>        double total = harga * jumlahBuku;</w:t>
             </w:r>
           </w:p>
           <w:p>
             <w:r>
               <w:lastRenderedPageBreak/>
-              <w:t xml:space="preserve">        double </w:t>
-            </w:r>
-            <w:proofErr w:type="spellStart"/>
-            <w:r>
-              <w:t>potongan</w:t>
-            </w:r>
-            <w:proofErr w:type="spellEnd"/>
-            <w:r>
-              <w:t xml:space="preserve"> = total * </w:t>
-            </w:r>
-            <w:proofErr w:type="spellStart"/>
-            <w:r>
-              <w:t>diskon</w:t>
-            </w:r>
-            <w:proofErr w:type="spellEnd"/>
-            <w:r>
-              <w:t xml:space="preserve"> / 100;</w:t>
-            </w:r>
-          </w:p>
-          <w:p>
-            <w:r>
-              <w:t xml:space="preserve">        double </w:t>
-            </w:r>
-            <w:proofErr w:type="spellStart"/>
-            <w:r>
-              <w:t>bayar</w:t>
-            </w:r>
-            <w:proofErr w:type="spellEnd"/>
-            <w:r>
-              <w:t xml:space="preserve"> = total - </w:t>
-            </w:r>
-            <w:proofErr w:type="spellStart"/>
-            <w:r>
-              <w:t>potongan</w:t>
-            </w:r>
-            <w:proofErr w:type="spellEnd"/>
-            <w:r>
-              <w:t>;</w:t>
+              <w:t>        double potongan = total * diskon / 100;</w:t>
+            </w:r>
+          </w:p>
+          <w:p>
+            <w:r>
+              <w:t>        double bayar = total - potongan;</w:t>
             </w:r>
           </w:p>
           <w:p/>
           <w:p>
             <w:r>
-              <w:t xml:space="preserve">        </w:t>
-            </w:r>
-            <w:proofErr w:type="spellStart"/>
-            <w:r>
-              <w:t>System.out.println</w:t>
-            </w:r>
-            <w:proofErr w:type="spellEnd"/>
-            <w:r>
-              <w:t>("</w:t>
-            </w:r>
-            <w:proofErr w:type="spellStart"/>
-            <w:r>
-              <w:t>Diskon</w:t>
-            </w:r>
-            <w:proofErr w:type="spellEnd"/>
-            <w:r>
-              <w:t xml:space="preserve">    </w:t>
-            </w:r>
-            <w:proofErr w:type="gramStart"/>
-            <w:r>
-              <w:t xml:space="preserve">  :</w:t>
-            </w:r>
-            <w:proofErr w:type="gramEnd"/>
-            <w:r>
-              <w:t xml:space="preserve"> " + </w:t>
-            </w:r>
-            <w:proofErr w:type="spellStart"/>
-            <w:r>
-              <w:t>diskon</w:t>
-            </w:r>
-            <w:proofErr w:type="spellEnd"/>
-            <w:r>
-              <w:t xml:space="preserve"> + "%");</w:t>
-            </w:r>
-          </w:p>
-          <w:p>
-            <w:r>
-              <w:t xml:space="preserve">        </w:t>
-            </w:r>
-            <w:proofErr w:type="spellStart"/>
-            <w:r>
-              <w:t>System.out.printf</w:t>
-            </w:r>
-            <w:proofErr w:type="spellEnd"/>
-            <w:r>
-              <w:t>("</w:t>
-            </w:r>
-            <w:proofErr w:type="spellStart"/>
-            <w:r>
-              <w:t>Potongan</w:t>
-            </w:r>
-            <w:proofErr w:type="spellEnd"/>
-            <w:r>
-              <w:t xml:space="preserve">  </w:t>
-            </w:r>
-            <w:proofErr w:type="gramStart"/>
-            <w:r>
-              <w:t xml:space="preserve">  :</w:t>
-            </w:r>
-            <w:proofErr w:type="gramEnd"/>
-            <w:r>
-              <w:t xml:space="preserve"> %.2f%n", </w:t>
-            </w:r>
-            <w:proofErr w:type="spellStart"/>
-            <w:r>
-              <w:t>potongan</w:t>
-            </w:r>
-            <w:proofErr w:type="spellEnd"/>
-            <w:r>
-              <w:t>);</w:t>
-            </w:r>
-          </w:p>
-          <w:p>
-            <w:r>
-              <w:t xml:space="preserve">        </w:t>
-            </w:r>
-            <w:proofErr w:type="spellStart"/>
-            <w:r>
-              <w:t>System.out.printf</w:t>
-            </w:r>
-            <w:proofErr w:type="spellEnd"/>
-            <w:r>
-              <w:t xml:space="preserve">("Total </w:t>
-            </w:r>
-            <w:proofErr w:type="spellStart"/>
-            <w:proofErr w:type="gramStart"/>
-            <w:r>
-              <w:t>bayar</w:t>
-            </w:r>
-            <w:proofErr w:type="spellEnd"/>
-            <w:r>
-              <w:t xml:space="preserve"> :</w:t>
-            </w:r>
-            <w:proofErr w:type="gramEnd"/>
-            <w:r>
-              <w:t xml:space="preserve"> %.2f%n", </w:t>
-            </w:r>
-            <w:proofErr w:type="spellStart"/>
-            <w:r>
-              <w:t>bayar</w:t>
-            </w:r>
-            <w:proofErr w:type="spellEnd"/>
-            <w:r>
-              <w:t>);</w:t>
+              <w:t>        System.out.println("Diskon      : " + diskon + "%");</w:t>
+            </w:r>
+          </w:p>
+          <w:p>
+            <w:r>
+              <w:t>        System.out.printf("Potongan    : %.2f%n", potongan);</w:t>
+            </w:r>
+          </w:p>
+          <w:p>
+            <w:r>
+              <w:t>        System.out.printf("Total bayar : %.2f%n", bayar);</w:t>
             </w:r>
           </w:p>
           <w:p/>
           <w:p>
             <w:r>
-              <w:t xml:space="preserve">        </w:t>
-            </w:r>
-            <w:proofErr w:type="spellStart"/>
-            <w:proofErr w:type="gramStart"/>
-            <w:r>
-              <w:t>sc.close</w:t>
-            </w:r>
-            <w:proofErr w:type="spellEnd"/>
-            <w:proofErr w:type="gramEnd"/>
-            <w:r>
-              <w:t>();</w:t>
+              <w:t>        sc.close();</w:t>
             </w:r>
           </w:p>
           <w:p>
@@ -1440,13 +841,8 @@
     <w:p>
       <w:r>
         <w:lastRenderedPageBreak/>
-        <w:t xml:space="preserve"> </w:t>
+        <w:t xml:space="preserve"> Output :</w:t>
       </w:r>
-      <w:proofErr w:type="gramStart"/>
-      <w:r>
-        <w:t>Output :</w:t>
-      </w:r>
-      <w:proofErr w:type="gramEnd"/>
     </w:p>
     <w:p>
       <w:r>
@@ -1491,11 +887,9 @@
       </w:r>
     </w:p>
     <w:p>
-      <w:proofErr w:type="gramStart"/>
       <w:r>
         <w:t>Pseudocode :</w:t>
       </w:r>
-      <w:proofErr w:type="gramEnd"/>
     </w:p>
     <w:tbl>
       <w:tblPr>
@@ -1518,363 +912,110 @@
           </w:p>
           <w:p/>
           <w:p>
-            <w:proofErr w:type="spellStart"/>
-            <w:r>
-              <w:t>Deklarasi</w:t>
-            </w:r>
-            <w:proofErr w:type="spellEnd"/>
-            <w:r>
-              <w:t>:</w:t>
-            </w:r>
-          </w:p>
-          <w:p>
-            <w:r>
-              <w:t xml:space="preserve">    </w:t>
-            </w:r>
-            <w:proofErr w:type="spellStart"/>
-            <w:r>
-              <w:t>hari</w:t>
-            </w:r>
-            <w:proofErr w:type="spellEnd"/>
-            <w:r>
-              <w:t xml:space="preserve">, </w:t>
-            </w:r>
-            <w:proofErr w:type="spellStart"/>
-            <w:proofErr w:type="gramStart"/>
-            <w:r>
-              <w:t>jenis</w:t>
-            </w:r>
-            <w:proofErr w:type="spellEnd"/>
-            <w:r>
-              <w:t xml:space="preserve"> :</w:t>
-            </w:r>
-            <w:proofErr w:type="gramEnd"/>
-            <w:r>
-              <w:t xml:space="preserve"> String</w:t>
-            </w:r>
-          </w:p>
-          <w:p>
-            <w:r>
-              <w:t xml:space="preserve">    </w:t>
-            </w:r>
-            <w:proofErr w:type="spellStart"/>
-            <w:r>
-              <w:t>harga</w:t>
-            </w:r>
-            <w:proofErr w:type="spellEnd"/>
-            <w:r>
-              <w:t xml:space="preserve">, total, </w:t>
-            </w:r>
-            <w:proofErr w:type="spellStart"/>
-            <w:r>
-              <w:t>potongan</w:t>
-            </w:r>
-            <w:proofErr w:type="spellEnd"/>
-            <w:r>
-              <w:t xml:space="preserve">, </w:t>
-            </w:r>
-            <w:proofErr w:type="spellStart"/>
-            <w:proofErr w:type="gramStart"/>
-            <w:r>
-              <w:t>bayar</w:t>
-            </w:r>
-            <w:proofErr w:type="spellEnd"/>
-            <w:r>
-              <w:t xml:space="preserve"> :</w:t>
-            </w:r>
-            <w:proofErr w:type="gramEnd"/>
-            <w:r>
-              <w:t xml:space="preserve"> Double</w:t>
-            </w:r>
-          </w:p>
-          <w:p>
-            <w:r>
-              <w:t xml:space="preserve">    </w:t>
-            </w:r>
-            <w:proofErr w:type="spellStart"/>
-            <w:r>
-              <w:t>jumlahBuku</w:t>
-            </w:r>
-            <w:proofErr w:type="spellEnd"/>
-            <w:r>
-              <w:t xml:space="preserve">, </w:t>
-            </w:r>
-            <w:proofErr w:type="spellStart"/>
-            <w:proofErr w:type="gramStart"/>
-            <w:r>
-              <w:t>diskon</w:t>
-            </w:r>
-            <w:proofErr w:type="spellEnd"/>
-            <w:r>
-              <w:t xml:space="preserve"> :</w:t>
-            </w:r>
-            <w:proofErr w:type="gramEnd"/>
-            <w:r>
-              <w:t xml:space="preserve"> Integer</w:t>
+            <w:r>
+              <w:t>Deklarasi:</w:t>
+            </w:r>
+          </w:p>
+          <w:p>
+            <w:r>
+              <w:t xml:space="preserve">    hari, jenis : String</w:t>
+            </w:r>
+          </w:p>
+          <w:p>
+            <w:r>
+              <w:t xml:space="preserve">    harga, total, potongan, bayar : Double</w:t>
+            </w:r>
+          </w:p>
+          <w:p>
+            <w:r>
+              <w:t xml:space="preserve">    jumlahBuku, diskon : Integer</w:t>
             </w:r>
           </w:p>
           <w:p/>
           <w:p>
-            <w:proofErr w:type="spellStart"/>
-            <w:r>
-              <w:t>Algoritma</w:t>
-            </w:r>
-            <w:proofErr w:type="spellEnd"/>
-            <w:r>
-              <w:t>:</w:t>
-            </w:r>
-          </w:p>
-          <w:p>
-            <w:r>
-              <w:t xml:space="preserve">    Output "Masukkan </w:t>
-            </w:r>
-            <w:proofErr w:type="spellStart"/>
-            <w:r>
-              <w:t>hari</w:t>
-            </w:r>
-            <w:proofErr w:type="spellEnd"/>
-            <w:r>
-              <w:t>"</w:t>
-            </w:r>
-          </w:p>
-          <w:p>
-            <w:r>
-              <w:t xml:space="preserve">    Input </w:t>
-            </w:r>
-            <w:proofErr w:type="spellStart"/>
-            <w:r>
-              <w:t>hari</w:t>
-            </w:r>
-            <w:proofErr w:type="spellEnd"/>
-          </w:p>
-          <w:p>
-            <w:r>
-              <w:t xml:space="preserve">    </w:t>
-            </w:r>
-            <w:proofErr w:type="spellStart"/>
-            <w:r>
-              <w:t>hari</w:t>
-            </w:r>
-            <w:proofErr w:type="spellEnd"/>
-            <w:r>
-              <w:t xml:space="preserve"> &lt;- </w:t>
-            </w:r>
-            <w:proofErr w:type="spellStart"/>
-            <w:r>
-              <w:t>LowerCase</w:t>
-            </w:r>
-            <w:proofErr w:type="spellEnd"/>
-            <w:r>
-              <w:t>(</w:t>
-            </w:r>
-            <w:proofErr w:type="spellStart"/>
-            <w:r>
-              <w:t>hari</w:t>
-            </w:r>
-            <w:proofErr w:type="spellEnd"/>
-            <w:r>
-              <w:t>)</w:t>
+            <w:r>
+              <w:t>Algoritma:</w:t>
+            </w:r>
+          </w:p>
+          <w:p>
+            <w:r>
+              <w:t xml:space="preserve">    Output "Masukkan hari"</w:t>
+            </w:r>
+          </w:p>
+          <w:p>
+            <w:r>
+              <w:t xml:space="preserve">    Input hari</w:t>
+            </w:r>
+          </w:p>
+          <w:p>
+            <w:r>
+              <w:t xml:space="preserve">    hari &lt;- LowerCase(hari)</w:t>
             </w:r>
           </w:p>
           <w:p/>
           <w:p>
             <w:r>
-              <w:t xml:space="preserve">    Output "Masukkan </w:t>
-            </w:r>
-            <w:proofErr w:type="spellStart"/>
-            <w:r>
-              <w:t>jenis</w:t>
-            </w:r>
-            <w:proofErr w:type="spellEnd"/>
-            <w:r>
-              <w:t xml:space="preserve"> </w:t>
-            </w:r>
-            <w:proofErr w:type="spellStart"/>
-            <w:r>
-              <w:t>buku</w:t>
-            </w:r>
-            <w:proofErr w:type="spellEnd"/>
-            <w:r>
-              <w:t>"</w:t>
-            </w:r>
-          </w:p>
-          <w:p>
-            <w:r>
-              <w:t xml:space="preserve">    Input </w:t>
-            </w:r>
-            <w:proofErr w:type="spellStart"/>
-            <w:r>
-              <w:t>jenis</w:t>
-            </w:r>
-            <w:proofErr w:type="spellEnd"/>
-          </w:p>
-          <w:p>
-            <w:r>
-              <w:t xml:space="preserve">    </w:t>
-            </w:r>
-            <w:proofErr w:type="spellStart"/>
-            <w:r>
-              <w:t>jenis</w:t>
-            </w:r>
-            <w:proofErr w:type="spellEnd"/>
-            <w:r>
-              <w:t xml:space="preserve"> &lt;- </w:t>
-            </w:r>
-            <w:proofErr w:type="spellStart"/>
-            <w:r>
-              <w:t>LowerCase</w:t>
-            </w:r>
-            <w:proofErr w:type="spellEnd"/>
-            <w:r>
-              <w:t>(</w:t>
-            </w:r>
-            <w:proofErr w:type="spellStart"/>
-            <w:r>
-              <w:t>jenis</w:t>
-            </w:r>
-            <w:proofErr w:type="spellEnd"/>
-            <w:r>
-              <w:t>)</w:t>
+              <w:t xml:space="preserve">    Output "Masukkan jenis buku"</w:t>
+            </w:r>
+          </w:p>
+          <w:p>
+            <w:r>
+              <w:t xml:space="preserve">    Input jenis</w:t>
+            </w:r>
+          </w:p>
+          <w:p>
+            <w:r>
+              <w:t xml:space="preserve">    jenis &lt;- LowerCase(jenis)</w:t>
             </w:r>
           </w:p>
           <w:p/>
           <w:p>
             <w:r>
-              <w:t xml:space="preserve">    Output "Masukkan </w:t>
-            </w:r>
-            <w:proofErr w:type="spellStart"/>
-            <w:r>
-              <w:t>harga</w:t>
-            </w:r>
-            <w:proofErr w:type="spellEnd"/>
-            <w:r>
-              <w:t xml:space="preserve"> per </w:t>
-            </w:r>
-            <w:proofErr w:type="spellStart"/>
-            <w:r>
-              <w:t>buku</w:t>
-            </w:r>
-            <w:proofErr w:type="spellEnd"/>
-            <w:r>
-              <w:t>"</w:t>
+              <w:t xml:space="preserve">    Output "Masukkan harga per buku"</w:t>
             </w:r>
           </w:p>
           <w:p>
             <w:r>
               <w:lastRenderedPageBreak/>
-              <w:t xml:space="preserve">    Input </w:t>
-            </w:r>
-            <w:proofErr w:type="spellStart"/>
-            <w:r>
-              <w:t>harga</w:t>
-            </w:r>
-            <w:proofErr w:type="spellEnd"/>
+              <w:t xml:space="preserve">    Input harga</w:t>
+            </w:r>
           </w:p>
           <w:p/>
           <w:p>
             <w:r>
-              <w:t xml:space="preserve">    Output "Masukkan </w:t>
-            </w:r>
-            <w:proofErr w:type="spellStart"/>
-            <w:r>
-              <w:t>jumlah</w:t>
-            </w:r>
-            <w:proofErr w:type="spellEnd"/>
-            <w:r>
-              <w:t xml:space="preserve"> </w:t>
-            </w:r>
-            <w:proofErr w:type="spellStart"/>
-            <w:r>
-              <w:t>buku</w:t>
-            </w:r>
-            <w:proofErr w:type="spellEnd"/>
-            <w:r>
-              <w:t>"</w:t>
-            </w:r>
-          </w:p>
-          <w:p>
-            <w:r>
-              <w:t xml:space="preserve">    Input </w:t>
-            </w:r>
-            <w:proofErr w:type="spellStart"/>
-            <w:r>
-              <w:t>jumlahBuku</w:t>
-            </w:r>
-            <w:proofErr w:type="spellEnd"/>
+              <w:t xml:space="preserve">    Output "Masukkan jumlah buku"</w:t>
+            </w:r>
+          </w:p>
+          <w:p>
+            <w:r>
+              <w:t xml:space="preserve">    Input jumlahBuku</w:t>
+            </w:r>
           </w:p>
           <w:p/>
           <w:p>
             <w:r>
-              <w:t xml:space="preserve">    </w:t>
-            </w:r>
-            <w:proofErr w:type="spellStart"/>
-            <w:r>
-              <w:t>diskon</w:t>
-            </w:r>
-            <w:proofErr w:type="spellEnd"/>
-            <w:r>
-              <w:t xml:space="preserve"> &lt;- 0</w:t>
+              <w:t xml:space="preserve">    diskon &lt;- 0</w:t>
             </w:r>
           </w:p>
           <w:p/>
           <w:p>
             <w:r>
-              <w:t xml:space="preserve">    IF </w:t>
-            </w:r>
-            <w:proofErr w:type="spellStart"/>
-            <w:r>
-              <w:t>hari</w:t>
-            </w:r>
-            <w:proofErr w:type="spellEnd"/>
-            <w:r>
-              <w:t xml:space="preserve"> = "</w:t>
-            </w:r>
-            <w:proofErr w:type="spellStart"/>
-            <w:r>
-              <w:t>rabu</w:t>
-            </w:r>
-            <w:proofErr w:type="spellEnd"/>
-            <w:r>
-              <w:t>" THEN</w:t>
-            </w:r>
-          </w:p>
-          <w:p>
-            <w:r>
-              <w:t xml:space="preserve">        IF </w:t>
-            </w:r>
-            <w:proofErr w:type="spellStart"/>
-            <w:r>
-              <w:t>jenis</w:t>
-            </w:r>
-            <w:proofErr w:type="spellEnd"/>
-            <w:r>
-              <w:t xml:space="preserve"> = "novel" THEN</w:t>
-            </w:r>
-          </w:p>
-          <w:p>
-            <w:r>
-              <w:t xml:space="preserve">            IF </w:t>
-            </w:r>
-            <w:proofErr w:type="spellStart"/>
-            <w:r>
-              <w:t>jumlahBuku</w:t>
-            </w:r>
-            <w:proofErr w:type="spellEnd"/>
-            <w:r>
-              <w:t xml:space="preserve"> &gt; 3 THEN</w:t>
-            </w:r>
-          </w:p>
-          <w:p>
-            <w:r>
-              <w:t xml:space="preserve">                </w:t>
-            </w:r>
-            <w:proofErr w:type="spellStart"/>
-            <w:r>
-              <w:t>diskon</w:t>
-            </w:r>
-            <w:proofErr w:type="spellEnd"/>
-            <w:r>
-              <w:t xml:space="preserve"> &lt;- 9</w:t>
+              <w:t xml:space="preserve">    IF hari = "rabu" THEN</w:t>
+            </w:r>
+          </w:p>
+          <w:p>
+            <w:r>
+              <w:t xml:space="preserve">        IF jenis = "novel" THEN</w:t>
+            </w:r>
+          </w:p>
+          <w:p>
+            <w:r>
+              <w:t xml:space="preserve">            IF jumlahBuku &gt; 3 THEN</w:t>
+            </w:r>
+          </w:p>
+          <w:p>
+            <w:r>
+              <w:t xml:space="preserve">                diskon &lt;- 9</w:t>
             </w:r>
           </w:p>
           <w:p>
@@ -1884,15 +1025,7 @@
           </w:p>
           <w:p>
             <w:r>
-              <w:t xml:space="preserve">                </w:t>
-            </w:r>
-            <w:proofErr w:type="spellStart"/>
-            <w:r>
-              <w:t>diskon</w:t>
-            </w:r>
-            <w:proofErr w:type="spellEnd"/>
-            <w:r>
-              <w:t xml:space="preserve"> &lt;- 8</w:t>
+              <w:t xml:space="preserve">                diskon &lt;- 8</w:t>
             </w:r>
           </w:p>
           <w:p>
@@ -1902,49 +1035,17 @@
           </w:p>
           <w:p>
             <w:r>
-              <w:t xml:space="preserve">        ELSE IF </w:t>
-            </w:r>
-            <w:proofErr w:type="spellStart"/>
-            <w:r>
-              <w:t>jenis</w:t>
-            </w:r>
-            <w:proofErr w:type="spellEnd"/>
-            <w:r>
-              <w:t xml:space="preserve"> = "</w:t>
-            </w:r>
-            <w:proofErr w:type="spellStart"/>
-            <w:r>
-              <w:t>kamus</w:t>
-            </w:r>
-            <w:proofErr w:type="spellEnd"/>
-            <w:r>
-              <w:t>" THEN</w:t>
-            </w:r>
-          </w:p>
-          <w:p>
-            <w:r>
-              <w:t xml:space="preserve">            IF </w:t>
-            </w:r>
-            <w:proofErr w:type="spellStart"/>
-            <w:r>
-              <w:t>jumlahBuku</w:t>
-            </w:r>
-            <w:proofErr w:type="spellEnd"/>
-            <w:r>
-              <w:t xml:space="preserve"> &gt; 2 THEN</w:t>
-            </w:r>
-          </w:p>
-          <w:p>
-            <w:r>
-              <w:t xml:space="preserve">                </w:t>
-            </w:r>
-            <w:proofErr w:type="spellStart"/>
-            <w:r>
-              <w:t>diskon</w:t>
-            </w:r>
-            <w:proofErr w:type="spellEnd"/>
-            <w:r>
-              <w:t xml:space="preserve"> &lt;- 12</w:t>
+              <w:t xml:space="preserve">        ELSE IF jenis = "kamus" THEN</w:t>
+            </w:r>
+          </w:p>
+          <w:p>
+            <w:r>
+              <w:t xml:space="preserve">            IF jumlahBuku &gt; 2 THEN</w:t>
+            </w:r>
+          </w:p>
+          <w:p>
+            <w:r>
+              <w:t xml:space="preserve">                diskon &lt;- 12</w:t>
             </w:r>
           </w:p>
           <w:p>
@@ -1954,15 +1055,7 @@
           </w:p>
           <w:p>
             <w:r>
-              <w:t xml:space="preserve">                </w:t>
-            </w:r>
-            <w:proofErr w:type="spellStart"/>
-            <w:r>
-              <w:t>diskon</w:t>
-            </w:r>
-            <w:proofErr w:type="spellEnd"/>
-            <w:r>
-              <w:t xml:space="preserve"> &lt;- 10</w:t>
+              <w:t xml:space="preserve">                diskon &lt;- 10</w:t>
             </w:r>
           </w:p>
           <w:p>
@@ -1977,28 +1070,12 @@
           </w:p>
           <w:p>
             <w:r>
-              <w:t xml:space="preserve">            IF </w:t>
-            </w:r>
-            <w:proofErr w:type="spellStart"/>
-            <w:r>
-              <w:t>jumlahBuku</w:t>
-            </w:r>
-            <w:proofErr w:type="spellEnd"/>
-            <w:r>
-              <w:t xml:space="preserve"> &gt; 3 THEN</w:t>
-            </w:r>
-          </w:p>
-          <w:p>
-            <w:r>
-              <w:t xml:space="preserve">                </w:t>
-            </w:r>
-            <w:proofErr w:type="spellStart"/>
-            <w:r>
-              <w:t>diskon</w:t>
-            </w:r>
-            <w:proofErr w:type="spellEnd"/>
-            <w:r>
-              <w:t xml:space="preserve"> &lt;- 5</w:t>
+              <w:t xml:space="preserve">            IF jumlahBuku &gt; 3 THEN</w:t>
+            </w:r>
+          </w:p>
+          <w:p>
+            <w:r>
+              <w:t xml:space="preserve">                diskon &lt;- 5</w:t>
             </w:r>
           </w:p>
           <w:p>
@@ -2008,15 +1085,7 @@
           </w:p>
           <w:p>
             <w:r>
-              <w:t xml:space="preserve">                </w:t>
-            </w:r>
-            <w:proofErr w:type="spellStart"/>
-            <w:r>
-              <w:t>diskon</w:t>
-            </w:r>
-            <w:proofErr w:type="spellEnd"/>
-            <w:r>
-              <w:t xml:space="preserve"> &lt;- 0</w:t>
+              <w:t xml:space="preserve">                diskon &lt;- 0</w:t>
             </w:r>
           </w:p>
           <w:p>
@@ -2037,139 +1106,34 @@
           <w:p/>
           <w:p>
             <w:r>
-              <w:t xml:space="preserve">    total &lt;- </w:t>
-            </w:r>
-            <w:proofErr w:type="spellStart"/>
-            <w:r>
-              <w:t>harga</w:t>
-            </w:r>
-            <w:proofErr w:type="spellEnd"/>
-            <w:r>
-              <w:t xml:space="preserve"> * </w:t>
-            </w:r>
-            <w:proofErr w:type="spellStart"/>
-            <w:r>
-              <w:t>jumlahBuku</w:t>
-            </w:r>
-            <w:proofErr w:type="spellEnd"/>
-          </w:p>
-          <w:p>
-            <w:r>
-              <w:t xml:space="preserve">    </w:t>
-            </w:r>
-            <w:proofErr w:type="spellStart"/>
-            <w:r>
-              <w:t>potongan</w:t>
-            </w:r>
-            <w:proofErr w:type="spellEnd"/>
-            <w:r>
-              <w:t xml:space="preserve"> &lt;- total * </w:t>
-            </w:r>
-            <w:proofErr w:type="spellStart"/>
-            <w:r>
-              <w:t>diskon</w:t>
-            </w:r>
-            <w:proofErr w:type="spellEnd"/>
-            <w:r>
-              <w:t xml:space="preserve"> / 100</w:t>
-            </w:r>
-          </w:p>
-          <w:p>
-            <w:r>
-              <w:t xml:space="preserve">    </w:t>
-            </w:r>
-            <w:proofErr w:type="spellStart"/>
-            <w:r>
-              <w:t>bayar</w:t>
-            </w:r>
-            <w:proofErr w:type="spellEnd"/>
-            <w:r>
-              <w:t xml:space="preserve"> &lt;- total - </w:t>
-            </w:r>
-            <w:proofErr w:type="spellStart"/>
-            <w:r>
-              <w:t>potongan</w:t>
-            </w:r>
-            <w:proofErr w:type="spellEnd"/>
+              <w:t xml:space="preserve">    total &lt;- harga * jumlahBuku</w:t>
+            </w:r>
+          </w:p>
+          <w:p>
+            <w:r>
+              <w:t xml:space="preserve">    potongan &lt;- total * diskon / 100</w:t>
+            </w:r>
+          </w:p>
+          <w:p>
+            <w:r>
+              <w:t xml:space="preserve">    bayar &lt;- total - potongan</w:t>
+            </w:r>
           </w:p>
           <w:p/>
           <w:p>
             <w:r>
-              <w:t xml:space="preserve">    Output "</w:t>
-            </w:r>
-            <w:proofErr w:type="spellStart"/>
-            <w:r>
-              <w:t>Diskon</w:t>
-            </w:r>
-            <w:proofErr w:type="spellEnd"/>
-            <w:r>
-              <w:t xml:space="preserve">    </w:t>
-            </w:r>
-            <w:proofErr w:type="gramStart"/>
-            <w:r>
-              <w:t xml:space="preserve">  :</w:t>
-            </w:r>
-            <w:proofErr w:type="gramEnd"/>
-            <w:r>
-              <w:t xml:space="preserve"> ", </w:t>
-            </w:r>
-            <w:proofErr w:type="spellStart"/>
-            <w:r>
-              <w:t>diskon</w:t>
-            </w:r>
-            <w:proofErr w:type="spellEnd"/>
-            <w:r>
-              <w:t>, "%"</w:t>
-            </w:r>
-          </w:p>
-          <w:p>
-            <w:r>
-              <w:t xml:space="preserve">    Output "</w:t>
-            </w:r>
-            <w:proofErr w:type="spellStart"/>
-            <w:r>
-              <w:t>Potongan</w:t>
-            </w:r>
-            <w:proofErr w:type="spellEnd"/>
-            <w:r>
-              <w:t xml:space="preserve">  </w:t>
-            </w:r>
-            <w:proofErr w:type="gramStart"/>
-            <w:r>
-              <w:t xml:space="preserve">  :</w:t>
-            </w:r>
-            <w:proofErr w:type="gramEnd"/>
-            <w:r>
-              <w:t xml:space="preserve"> ", </w:t>
-            </w:r>
-            <w:proofErr w:type="spellStart"/>
-            <w:r>
-              <w:t>potongan</w:t>
-            </w:r>
-            <w:proofErr w:type="spellEnd"/>
-          </w:p>
-          <w:p>
-            <w:r>
-              <w:t xml:space="preserve">    Output "Total </w:t>
-            </w:r>
-            <w:proofErr w:type="spellStart"/>
-            <w:proofErr w:type="gramStart"/>
-            <w:r>
-              <w:t>bayar</w:t>
-            </w:r>
-            <w:proofErr w:type="spellEnd"/>
-            <w:r>
-              <w:t xml:space="preserve"> :</w:t>
-            </w:r>
-            <w:proofErr w:type="gramEnd"/>
-            <w:r>
-              <w:t xml:space="preserve"> ", </w:t>
-            </w:r>
-            <w:proofErr w:type="spellStart"/>
-            <w:r>
-              <w:t>bayar</w:t>
-            </w:r>
-            <w:proofErr w:type="spellEnd"/>
+              <w:t xml:space="preserve">    Output "Diskon      : ", diskon, "%"</w:t>
+            </w:r>
+          </w:p>
+          <w:p>
+            <w:r>
+              <w:t xml:space="preserve">    Output "Potongan    : ", potongan</w:t>
+            </w:r>
+          </w:p>
+          <w:p>
+            <w:r>
+              <w:t xml:space="preserve">    Output "Total bayar : ", bayar</w:t>
+            </w:r>
           </w:p>
         </w:tc>
       </w:tr>
@@ -2331,11 +1295,9 @@
           </wp:anchor>
         </w:drawing>
       </w:r>
-      <w:proofErr w:type="gramStart"/>
       <w:r>
         <w:t>Flowchart :</w:t>
       </w:r>
-      <w:proofErr w:type="gramEnd"/>
     </w:p>
     <w:p>
       <w:pPr>
@@ -2370,29 +1332,7 @@
               <w:rPr>
                 <w:rFonts w:ascii="Bahnschrift Light" w:hAnsi="Bahnschrift Light"/>
               </w:rPr>
-              <w:t xml:space="preserve">import </w:t>
-            </w:r>
-            <w:proofErr w:type="spellStart"/>
-            <w:proofErr w:type="gramStart"/>
-            <w:r>
-              <w:rPr>
-                <w:rFonts w:ascii="Bahnschrift Light" w:hAnsi="Bahnschrift Light"/>
-              </w:rPr>
-              <w:t>java.util</w:t>
-            </w:r>
-            <w:proofErr w:type="gramEnd"/>
-            <w:r>
-              <w:rPr>
-                <w:rFonts w:ascii="Bahnschrift Light" w:hAnsi="Bahnschrift Light"/>
-              </w:rPr>
-              <w:t>.Scanner</w:t>
-            </w:r>
-            <w:proofErr w:type="spellEnd"/>
-            <w:r>
-              <w:rPr>
-                <w:rFonts w:ascii="Bahnschrift Light" w:hAnsi="Bahnschrift Light"/>
-              </w:rPr>
-              <w:t>;</w:t>
+              <w:t>import java.util.Scanner;</w:t>
             </w:r>
           </w:p>
           <w:p>
@@ -2425,601 +1365,217 @@
               <w:rPr>
                 <w:rFonts w:ascii="Bahnschrift Light" w:hAnsi="Bahnschrift Light"/>
               </w:rPr>
-              <w:t xml:space="preserve">    public static void </w:t>
-            </w:r>
-            <w:proofErr w:type="gramStart"/>
-            <w:r>
-              <w:rPr>
-                <w:rFonts w:ascii="Bahnschrift Light" w:hAnsi="Bahnschrift Light"/>
-              </w:rPr>
-              <w:t>main(String[</w:t>
-            </w:r>
-            <w:proofErr w:type="gramEnd"/>
-            <w:r>
-              <w:rPr>
-                <w:rFonts w:ascii="Bahnschrift Light" w:hAnsi="Bahnschrift Light"/>
-              </w:rPr>
-              <w:t xml:space="preserve">] </w:t>
-            </w:r>
-            <w:proofErr w:type="spellStart"/>
-            <w:r>
-              <w:rPr>
-                <w:rFonts w:ascii="Bahnschrift Light" w:hAnsi="Bahnschrift Light"/>
-              </w:rPr>
-              <w:t>args</w:t>
-            </w:r>
-            <w:proofErr w:type="spellEnd"/>
-            <w:r>
-              <w:rPr>
-                <w:rFonts w:ascii="Bahnschrift Light" w:hAnsi="Bahnschrift Light"/>
-              </w:rPr>
-              <w:t>) {</w:t>
-            </w:r>
-          </w:p>
-          <w:p>
-            <w:pPr>
-              <w:rPr>
-                <w:rFonts w:ascii="Bahnschrift Light" w:hAnsi="Bahnschrift Light"/>
-              </w:rPr>
-            </w:pPr>
-            <w:r>
-              <w:rPr>
-                <w:rFonts w:ascii="Bahnschrift Light" w:hAnsi="Bahnschrift Light"/>
-              </w:rPr>
-              <w:t xml:space="preserve">        Scanner </w:t>
-            </w:r>
-            <w:proofErr w:type="spellStart"/>
-            <w:r>
-              <w:rPr>
-                <w:rFonts w:ascii="Bahnschrift Light" w:hAnsi="Bahnschrift Light"/>
-              </w:rPr>
-              <w:t>sc</w:t>
-            </w:r>
-            <w:proofErr w:type="spellEnd"/>
-            <w:r>
-              <w:rPr>
-                <w:rFonts w:ascii="Bahnschrift Light" w:hAnsi="Bahnschrift Light"/>
-              </w:rPr>
-              <w:t xml:space="preserve"> = new </w:t>
-            </w:r>
-            <w:proofErr w:type="gramStart"/>
-            <w:r>
-              <w:rPr>
-                <w:rFonts w:ascii="Bahnschrift Light" w:hAnsi="Bahnschrift Light"/>
-              </w:rPr>
-              <w:t>Scanner(</w:t>
-            </w:r>
-            <w:proofErr w:type="gramEnd"/>
-            <w:r>
-              <w:rPr>
-                <w:rFonts w:ascii="Bahnschrift Light" w:hAnsi="Bahnschrift Light"/>
-              </w:rPr>
-              <w:t>System.in);</w:t>
-            </w:r>
-          </w:p>
-          <w:p>
-            <w:pPr>
-              <w:rPr>
-                <w:rFonts w:ascii="Bahnschrift Light" w:hAnsi="Bahnschrift Light"/>
-              </w:rPr>
-            </w:pPr>
-          </w:p>
-          <w:p>
-            <w:pPr>
-              <w:rPr>
-                <w:rFonts w:ascii="Bahnschrift Light" w:hAnsi="Bahnschrift Light"/>
-              </w:rPr>
-            </w:pPr>
-            <w:r>
-              <w:rPr>
-                <w:rFonts w:ascii="Bahnschrift Light" w:hAnsi="Bahnschrift Light"/>
-              </w:rPr>
-              <w:t xml:space="preserve">        </w:t>
-            </w:r>
-            <w:proofErr w:type="spellStart"/>
-            <w:r>
-              <w:rPr>
-                <w:rFonts w:ascii="Bahnschrift Light" w:hAnsi="Bahnschrift Light"/>
-              </w:rPr>
-              <w:t>System.out.print</w:t>
-            </w:r>
-            <w:proofErr w:type="spellEnd"/>
-            <w:r>
-              <w:rPr>
-                <w:rFonts w:ascii="Bahnschrift Light" w:hAnsi="Bahnschrift Light"/>
-              </w:rPr>
-              <w:t xml:space="preserve">("Merk   </w:t>
-            </w:r>
-            <w:proofErr w:type="gramStart"/>
-            <w:r>
-              <w:rPr>
-                <w:rFonts w:ascii="Bahnschrift Light" w:hAnsi="Bahnschrift Light"/>
-              </w:rPr>
-              <w:t>  :</w:t>
-            </w:r>
-            <w:proofErr w:type="gramEnd"/>
-            <w:r>
-              <w:rPr>
-                <w:rFonts w:ascii="Bahnschrift Light" w:hAnsi="Bahnschrift Light"/>
-              </w:rPr>
-              <w:t xml:space="preserve"> ");</w:t>
-            </w:r>
-          </w:p>
-          <w:p>
-            <w:pPr>
-              <w:rPr>
-                <w:rFonts w:ascii="Bahnschrift Light" w:hAnsi="Bahnschrift Light"/>
-              </w:rPr>
-            </w:pPr>
-            <w:r>
-              <w:rPr>
-                <w:rFonts w:ascii="Bahnschrift Light" w:hAnsi="Bahnschrift Light"/>
-              </w:rPr>
-              <w:t xml:space="preserve">        String merk = </w:t>
-            </w:r>
-            <w:proofErr w:type="spellStart"/>
-            <w:proofErr w:type="gramStart"/>
-            <w:r>
-              <w:rPr>
-                <w:rFonts w:ascii="Bahnschrift Light" w:hAnsi="Bahnschrift Light"/>
-              </w:rPr>
-              <w:t>sc.nextLine</w:t>
-            </w:r>
-            <w:proofErr w:type="spellEnd"/>
-            <w:proofErr w:type="gramEnd"/>
-            <w:r>
-              <w:rPr>
-                <w:rFonts w:ascii="Bahnschrift Light" w:hAnsi="Bahnschrift Light"/>
-              </w:rPr>
-              <w:t>(</w:t>
-            </w:r>
-            <w:proofErr w:type="gramStart"/>
-            <w:r>
-              <w:rPr>
-                <w:rFonts w:ascii="Bahnschrift Light" w:hAnsi="Bahnschrift Light"/>
-              </w:rPr>
-              <w:t>).</w:t>
-            </w:r>
-            <w:proofErr w:type="spellStart"/>
-            <w:r>
-              <w:rPr>
-                <w:rFonts w:ascii="Bahnschrift Light" w:hAnsi="Bahnschrift Light"/>
-              </w:rPr>
-              <w:t>toLowerCase</w:t>
-            </w:r>
-            <w:proofErr w:type="spellEnd"/>
-            <w:proofErr w:type="gramEnd"/>
-            <w:r>
-              <w:rPr>
-                <w:rFonts w:ascii="Bahnschrift Light" w:hAnsi="Bahnschrift Light"/>
-              </w:rPr>
-              <w:t>();</w:t>
-            </w:r>
-          </w:p>
-          <w:p>
-            <w:pPr>
-              <w:rPr>
-                <w:rFonts w:ascii="Bahnschrift Light" w:hAnsi="Bahnschrift Light"/>
-              </w:rPr>
-            </w:pPr>
-            <w:r>
-              <w:rPr>
-                <w:rFonts w:ascii="Bahnschrift Light" w:hAnsi="Bahnschrift Light"/>
-              </w:rPr>
-              <w:t xml:space="preserve">        </w:t>
-            </w:r>
-            <w:proofErr w:type="spellStart"/>
-            <w:r>
-              <w:rPr>
-                <w:rFonts w:ascii="Bahnschrift Light" w:hAnsi="Bahnschrift Light"/>
-              </w:rPr>
-              <w:t>System.out.print</w:t>
-            </w:r>
-            <w:proofErr w:type="spellEnd"/>
-            <w:r>
-              <w:rPr>
-                <w:rFonts w:ascii="Bahnschrift Light" w:hAnsi="Bahnschrift Light"/>
-              </w:rPr>
-              <w:t>("</w:t>
-            </w:r>
-            <w:proofErr w:type="spellStart"/>
-            <w:proofErr w:type="gramStart"/>
-            <w:r>
-              <w:rPr>
-                <w:rFonts w:ascii="Bahnschrift Light" w:hAnsi="Bahnschrift Light"/>
-              </w:rPr>
-              <w:t>Kategori</w:t>
-            </w:r>
-            <w:proofErr w:type="spellEnd"/>
-            <w:r>
-              <w:rPr>
-                <w:rFonts w:ascii="Bahnschrift Light" w:hAnsi="Bahnschrift Light"/>
-              </w:rPr>
-              <w:t xml:space="preserve"> :</w:t>
-            </w:r>
-            <w:proofErr w:type="gramEnd"/>
-            <w:r>
-              <w:rPr>
-                <w:rFonts w:ascii="Bahnschrift Light" w:hAnsi="Bahnschrift Light"/>
-              </w:rPr>
-              <w:t xml:space="preserve"> ");</w:t>
-            </w:r>
-          </w:p>
-          <w:p>
-            <w:pPr>
-              <w:rPr>
-                <w:rFonts w:ascii="Bahnschrift Light" w:hAnsi="Bahnschrift Light"/>
-              </w:rPr>
-            </w:pPr>
-            <w:r>
-              <w:rPr>
-                <w:rFonts w:ascii="Bahnschrift Light" w:hAnsi="Bahnschrift Light"/>
-              </w:rPr>
-              <w:t xml:space="preserve">        String </w:t>
-            </w:r>
-            <w:proofErr w:type="spellStart"/>
-            <w:r>
-              <w:rPr>
-                <w:rFonts w:ascii="Bahnschrift Light" w:hAnsi="Bahnschrift Light"/>
-              </w:rPr>
-              <w:t>kategori</w:t>
-            </w:r>
-            <w:proofErr w:type="spellEnd"/>
-            <w:r>
-              <w:rPr>
-                <w:rFonts w:ascii="Bahnschrift Light" w:hAnsi="Bahnschrift Light"/>
-              </w:rPr>
-              <w:t xml:space="preserve"> = </w:t>
-            </w:r>
-            <w:proofErr w:type="spellStart"/>
-            <w:proofErr w:type="gramStart"/>
-            <w:r>
-              <w:rPr>
-                <w:rFonts w:ascii="Bahnschrift Light" w:hAnsi="Bahnschrift Light"/>
-              </w:rPr>
-              <w:t>sc.nextLine</w:t>
-            </w:r>
-            <w:proofErr w:type="spellEnd"/>
-            <w:proofErr w:type="gramEnd"/>
-            <w:r>
-              <w:rPr>
-                <w:rFonts w:ascii="Bahnschrift Light" w:hAnsi="Bahnschrift Light"/>
-              </w:rPr>
-              <w:t>(</w:t>
-            </w:r>
-            <w:proofErr w:type="gramStart"/>
-            <w:r>
-              <w:rPr>
-                <w:rFonts w:ascii="Bahnschrift Light" w:hAnsi="Bahnschrift Light"/>
-              </w:rPr>
-              <w:t>).</w:t>
-            </w:r>
-            <w:proofErr w:type="spellStart"/>
-            <w:r>
-              <w:rPr>
-                <w:rFonts w:ascii="Bahnschrift Light" w:hAnsi="Bahnschrift Light"/>
-              </w:rPr>
-              <w:t>toLowerCase</w:t>
-            </w:r>
-            <w:proofErr w:type="spellEnd"/>
-            <w:proofErr w:type="gramEnd"/>
-            <w:r>
-              <w:rPr>
-                <w:rFonts w:ascii="Bahnschrift Light" w:hAnsi="Bahnschrift Light"/>
-              </w:rPr>
-              <w:t>();</w:t>
-            </w:r>
-          </w:p>
-          <w:p>
-            <w:pPr>
-              <w:rPr>
-                <w:rFonts w:ascii="Bahnschrift Light" w:hAnsi="Bahnschrift Light"/>
-              </w:rPr>
-            </w:pPr>
-            <w:r>
-              <w:rPr>
-                <w:rFonts w:ascii="Bahnschrift Light" w:hAnsi="Bahnschrift Light"/>
-              </w:rPr>
-              <w:t xml:space="preserve">        </w:t>
-            </w:r>
-            <w:proofErr w:type="spellStart"/>
-            <w:r>
-              <w:rPr>
-                <w:rFonts w:ascii="Bahnschrift Light" w:hAnsi="Bahnschrift Light"/>
-              </w:rPr>
-              <w:t>System.out.print</w:t>
-            </w:r>
-            <w:proofErr w:type="spellEnd"/>
-            <w:r>
-              <w:rPr>
-                <w:rFonts w:ascii="Bahnschrift Light" w:hAnsi="Bahnschrift Light"/>
-              </w:rPr>
-              <w:t>("</w:t>
-            </w:r>
-            <w:proofErr w:type="spellStart"/>
-            <w:r>
-              <w:rPr>
-                <w:rFonts w:ascii="Bahnschrift Light" w:hAnsi="Bahnschrift Light"/>
-              </w:rPr>
-              <w:t>Ukuran</w:t>
-            </w:r>
-            <w:proofErr w:type="spellEnd"/>
-            <w:r>
-              <w:rPr>
-                <w:rFonts w:ascii="Bahnschrift Light" w:hAnsi="Bahnschrift Light"/>
-              </w:rPr>
-              <w:t xml:space="preserve"> </w:t>
-            </w:r>
-            <w:proofErr w:type="gramStart"/>
-            <w:r>
-              <w:rPr>
-                <w:rFonts w:ascii="Bahnschrift Light" w:hAnsi="Bahnschrift Light"/>
-              </w:rPr>
-              <w:t>  :</w:t>
-            </w:r>
-            <w:proofErr w:type="gramEnd"/>
-            <w:r>
-              <w:rPr>
-                <w:rFonts w:ascii="Bahnschrift Light" w:hAnsi="Bahnschrift Light"/>
-              </w:rPr>
-              <w:t xml:space="preserve"> ");</w:t>
-            </w:r>
-          </w:p>
-          <w:p>
-            <w:pPr>
-              <w:rPr>
-                <w:rFonts w:ascii="Bahnschrift Light" w:hAnsi="Bahnschrift Light"/>
-              </w:rPr>
-            </w:pPr>
-            <w:r>
-              <w:rPr>
-                <w:rFonts w:ascii="Bahnschrift Light" w:hAnsi="Bahnschrift Light"/>
-              </w:rPr>
-              <w:t xml:space="preserve">        int </w:t>
-            </w:r>
-            <w:proofErr w:type="spellStart"/>
-            <w:r>
-              <w:rPr>
-                <w:rFonts w:ascii="Bahnschrift Light" w:hAnsi="Bahnschrift Light"/>
-              </w:rPr>
-              <w:t>ukuran</w:t>
-            </w:r>
-            <w:proofErr w:type="spellEnd"/>
-            <w:r>
-              <w:rPr>
-                <w:rFonts w:ascii="Bahnschrift Light" w:hAnsi="Bahnschrift Light"/>
-              </w:rPr>
-              <w:t xml:space="preserve"> = </w:t>
-            </w:r>
-            <w:proofErr w:type="spellStart"/>
-            <w:proofErr w:type="gramStart"/>
-            <w:r>
-              <w:rPr>
-                <w:rFonts w:ascii="Bahnschrift Light" w:hAnsi="Bahnschrift Light"/>
-              </w:rPr>
-              <w:t>sc.nextInt</w:t>
-            </w:r>
-            <w:proofErr w:type="spellEnd"/>
-            <w:proofErr w:type="gramEnd"/>
-            <w:r>
-              <w:rPr>
-                <w:rFonts w:ascii="Bahnschrift Light" w:hAnsi="Bahnschrift Light"/>
-              </w:rPr>
-              <w:t>();</w:t>
-            </w:r>
-          </w:p>
-          <w:p>
-            <w:pPr>
-              <w:rPr>
-                <w:rFonts w:ascii="Bahnschrift Light" w:hAnsi="Bahnschrift Light"/>
-              </w:rPr>
-            </w:pPr>
-          </w:p>
-          <w:p>
-            <w:pPr>
-              <w:rPr>
-                <w:rFonts w:ascii="Bahnschrift Light" w:hAnsi="Bahnschrift Light"/>
-              </w:rPr>
-            </w:pPr>
-            <w:r>
-              <w:rPr>
-                <w:rFonts w:ascii="Bahnschrift Light" w:hAnsi="Bahnschrift Light"/>
-              </w:rPr>
-              <w:t xml:space="preserve">        int </w:t>
-            </w:r>
-            <w:proofErr w:type="spellStart"/>
-            <w:r>
-              <w:rPr>
-                <w:rFonts w:ascii="Bahnschrift Light" w:hAnsi="Bahnschrift Light"/>
-              </w:rPr>
-              <w:t>harga</w:t>
-            </w:r>
-            <w:proofErr w:type="spellEnd"/>
-            <w:r>
-              <w:rPr>
-                <w:rFonts w:ascii="Bahnschrift Light" w:hAnsi="Bahnschrift Light"/>
-              </w:rPr>
-              <w:t xml:space="preserve"> = 0;</w:t>
-            </w:r>
-          </w:p>
-          <w:p>
-            <w:pPr>
-              <w:rPr>
-                <w:rFonts w:ascii="Bahnschrift Light" w:hAnsi="Bahnschrift Light"/>
-              </w:rPr>
-            </w:pPr>
-          </w:p>
-          <w:p>
-            <w:pPr>
-              <w:rPr>
-                <w:rFonts w:ascii="Bahnschrift Light" w:hAnsi="Bahnschrift Light"/>
-              </w:rPr>
-            </w:pPr>
-            <w:r>
-              <w:rPr>
-                <w:rFonts w:ascii="Bahnschrift Light" w:hAnsi="Bahnschrift Light"/>
-              </w:rPr>
-              <w:t>        if (</w:t>
-            </w:r>
-            <w:proofErr w:type="spellStart"/>
-            <w:r>
-              <w:rPr>
-                <w:rFonts w:ascii="Bahnschrift Light" w:hAnsi="Bahnschrift Light"/>
-              </w:rPr>
-              <w:t>ukuran</w:t>
-            </w:r>
-            <w:proofErr w:type="spellEnd"/>
-            <w:r>
-              <w:rPr>
-                <w:rFonts w:ascii="Bahnschrift Light" w:hAnsi="Bahnschrift Light"/>
-              </w:rPr>
-              <w:t xml:space="preserve"> &gt;= 36) {</w:t>
-            </w:r>
-          </w:p>
-          <w:p>
-            <w:pPr>
-              <w:rPr>
-                <w:rFonts w:ascii="Bahnschrift Light" w:hAnsi="Bahnschrift Light"/>
-              </w:rPr>
-            </w:pPr>
-            <w:r>
-              <w:rPr>
-                <w:rFonts w:ascii="Bahnschrift Light" w:hAnsi="Bahnschrift Light"/>
-              </w:rPr>
-              <w:t>            if (</w:t>
-            </w:r>
-            <w:proofErr w:type="spellStart"/>
-            <w:r>
-              <w:rPr>
-                <w:rFonts w:ascii="Bahnschrift Light" w:hAnsi="Bahnschrift Light"/>
-              </w:rPr>
-              <w:t>ukuran</w:t>
-            </w:r>
-            <w:proofErr w:type="spellEnd"/>
-            <w:r>
-              <w:rPr>
-                <w:rFonts w:ascii="Bahnschrift Light" w:hAnsi="Bahnschrift Light"/>
-              </w:rPr>
-              <w:t xml:space="preserve"> &lt;= 44) {</w:t>
-            </w:r>
-          </w:p>
-          <w:p>
-            <w:pPr>
-              <w:rPr>
-                <w:rFonts w:ascii="Bahnschrift Light" w:hAnsi="Bahnschrift Light"/>
-              </w:rPr>
-            </w:pPr>
-          </w:p>
-          <w:p>
-            <w:pPr>
-              <w:rPr>
-                <w:rFonts w:ascii="Bahnschrift Light" w:hAnsi="Bahnschrift Light"/>
-              </w:rPr>
-            </w:pPr>
-            <w:r>
-              <w:rPr>
-                <w:rFonts w:ascii="Bahnschrift Light" w:hAnsi="Bahnschrift Light"/>
-              </w:rPr>
-              <w:t>                if (</w:t>
-            </w:r>
-            <w:proofErr w:type="spellStart"/>
-            <w:proofErr w:type="gramStart"/>
-            <w:r>
-              <w:rPr>
-                <w:rFonts w:ascii="Bahnschrift Light" w:hAnsi="Bahnschrift Light"/>
-              </w:rPr>
-              <w:t>merk.equals</w:t>
-            </w:r>
-            <w:proofErr w:type="spellEnd"/>
-            <w:proofErr w:type="gramEnd"/>
-            <w:r>
-              <w:rPr>
-                <w:rFonts w:ascii="Bahnschrift Light" w:hAnsi="Bahnschrift Light"/>
-              </w:rPr>
-              <w:t>("Converse")) {</w:t>
-            </w:r>
-          </w:p>
-          <w:p>
-            <w:pPr>
-              <w:rPr>
-                <w:rFonts w:ascii="Bahnschrift Light" w:hAnsi="Bahnschrift Light"/>
-              </w:rPr>
-            </w:pPr>
-            <w:r>
-              <w:rPr>
-                <w:rFonts w:ascii="Bahnschrift Light" w:hAnsi="Bahnschrift Light"/>
-              </w:rPr>
-              <w:t>                    if (</w:t>
-            </w:r>
-            <w:proofErr w:type="spellStart"/>
-            <w:proofErr w:type="gramStart"/>
-            <w:r>
-              <w:rPr>
-                <w:rFonts w:ascii="Bahnschrift Light" w:hAnsi="Bahnschrift Light"/>
-              </w:rPr>
-              <w:t>kategori.equals</w:t>
-            </w:r>
-            <w:proofErr w:type="spellEnd"/>
-            <w:proofErr w:type="gramEnd"/>
-            <w:r>
-              <w:rPr>
-                <w:rFonts w:ascii="Bahnschrift Light" w:hAnsi="Bahnschrift Light"/>
-              </w:rPr>
-              <w:t>("Slip On")) {</w:t>
-            </w:r>
-          </w:p>
-          <w:p>
-            <w:pPr>
-              <w:rPr>
-                <w:rFonts w:ascii="Bahnschrift Light" w:hAnsi="Bahnschrift Light"/>
-              </w:rPr>
-            </w:pPr>
-            <w:r>
-              <w:rPr>
-                <w:rFonts w:ascii="Bahnschrift Light" w:hAnsi="Bahnschrift Light"/>
-              </w:rPr>
-              <w:t>                        if (</w:t>
-            </w:r>
-            <w:proofErr w:type="spellStart"/>
-            <w:r>
-              <w:rPr>
-                <w:rFonts w:ascii="Bahnschrift Light" w:hAnsi="Bahnschrift Light"/>
-              </w:rPr>
-              <w:t>ukuran</w:t>
-            </w:r>
-            <w:proofErr w:type="spellEnd"/>
-            <w:r>
-              <w:rPr>
-                <w:rFonts w:ascii="Bahnschrift Light" w:hAnsi="Bahnschrift Light"/>
-              </w:rPr>
-              <w:t xml:space="preserve"> &lt;= 40) {</w:t>
-            </w:r>
-          </w:p>
-          <w:p>
-            <w:pPr>
-              <w:rPr>
-                <w:rFonts w:ascii="Bahnschrift Light" w:hAnsi="Bahnschrift Light"/>
-              </w:rPr>
-            </w:pPr>
-            <w:r>
-              <w:rPr>
-                <w:rFonts w:ascii="Bahnschrift Light" w:hAnsi="Bahnschrift Light"/>
-              </w:rPr>
-              <w:t xml:space="preserve">                            </w:t>
-            </w:r>
-            <w:proofErr w:type="spellStart"/>
-            <w:r>
-              <w:rPr>
-                <w:rFonts w:ascii="Bahnschrift Light" w:hAnsi="Bahnschrift Light"/>
-              </w:rPr>
-              <w:t>harga</w:t>
-            </w:r>
-            <w:proofErr w:type="spellEnd"/>
-            <w:r>
-              <w:rPr>
-                <w:rFonts w:ascii="Bahnschrift Light" w:hAnsi="Bahnschrift Light"/>
-              </w:rPr>
-              <w:t xml:space="preserve"> = 800000;</w:t>
+              <w:t>    public static void main(String[] args) {</w:t>
+            </w:r>
+          </w:p>
+          <w:p>
+            <w:pPr>
+              <w:rPr>
+                <w:rFonts w:ascii="Bahnschrift Light" w:hAnsi="Bahnschrift Light"/>
+              </w:rPr>
+            </w:pPr>
+            <w:r>
+              <w:rPr>
+                <w:rFonts w:ascii="Bahnschrift Light" w:hAnsi="Bahnschrift Light"/>
+              </w:rPr>
+              <w:t>        Scanner sc = new Scanner(System.in);</w:t>
+            </w:r>
+          </w:p>
+          <w:p>
+            <w:pPr>
+              <w:rPr>
+                <w:rFonts w:ascii="Bahnschrift Light" w:hAnsi="Bahnschrift Light"/>
+              </w:rPr>
+            </w:pPr>
+          </w:p>
+          <w:p>
+            <w:pPr>
+              <w:rPr>
+                <w:rFonts w:ascii="Bahnschrift Light" w:hAnsi="Bahnschrift Light"/>
+              </w:rPr>
+            </w:pPr>
+            <w:r>
+              <w:rPr>
+                <w:rFonts w:ascii="Bahnschrift Light" w:hAnsi="Bahnschrift Light"/>
+              </w:rPr>
+              <w:t>        System.out.print("Merk     : ");</w:t>
+            </w:r>
+          </w:p>
+          <w:p>
+            <w:pPr>
+              <w:rPr>
+                <w:rFonts w:ascii="Bahnschrift Light" w:hAnsi="Bahnschrift Light"/>
+              </w:rPr>
+            </w:pPr>
+            <w:r>
+              <w:rPr>
+                <w:rFonts w:ascii="Bahnschrift Light" w:hAnsi="Bahnschrift Light"/>
+              </w:rPr>
+              <w:t>        String merk = sc.nextLine().toLowerCase();</w:t>
+            </w:r>
+          </w:p>
+          <w:p>
+            <w:pPr>
+              <w:rPr>
+                <w:rFonts w:ascii="Bahnschrift Light" w:hAnsi="Bahnschrift Light"/>
+              </w:rPr>
+            </w:pPr>
+            <w:r>
+              <w:rPr>
+                <w:rFonts w:ascii="Bahnschrift Light" w:hAnsi="Bahnschrift Light"/>
+              </w:rPr>
+              <w:t>        System.out.print("Kategori : ");</w:t>
+            </w:r>
+          </w:p>
+          <w:p>
+            <w:pPr>
+              <w:rPr>
+                <w:rFonts w:ascii="Bahnschrift Light" w:hAnsi="Bahnschrift Light"/>
+              </w:rPr>
+            </w:pPr>
+            <w:r>
+              <w:rPr>
+                <w:rFonts w:ascii="Bahnschrift Light" w:hAnsi="Bahnschrift Light"/>
+              </w:rPr>
+              <w:t>        String kategori = sc.nextLine().toLowerCase();</w:t>
+            </w:r>
+          </w:p>
+          <w:p>
+            <w:pPr>
+              <w:rPr>
+                <w:rFonts w:ascii="Bahnschrift Light" w:hAnsi="Bahnschrift Light"/>
+              </w:rPr>
+            </w:pPr>
+            <w:r>
+              <w:rPr>
+                <w:rFonts w:ascii="Bahnschrift Light" w:hAnsi="Bahnschrift Light"/>
+              </w:rPr>
+              <w:t>        System.out.print("Ukuran   : ");</w:t>
+            </w:r>
+          </w:p>
+          <w:p>
+            <w:pPr>
+              <w:rPr>
+                <w:rFonts w:ascii="Bahnschrift Light" w:hAnsi="Bahnschrift Light"/>
+              </w:rPr>
+            </w:pPr>
+            <w:r>
+              <w:rPr>
+                <w:rFonts w:ascii="Bahnschrift Light" w:hAnsi="Bahnschrift Light"/>
+              </w:rPr>
+              <w:t>        int ukuran = sc.nextInt();</w:t>
+            </w:r>
+          </w:p>
+          <w:p>
+            <w:pPr>
+              <w:rPr>
+                <w:rFonts w:ascii="Bahnschrift Light" w:hAnsi="Bahnschrift Light"/>
+              </w:rPr>
+            </w:pPr>
+          </w:p>
+          <w:p>
+            <w:pPr>
+              <w:rPr>
+                <w:rFonts w:ascii="Bahnschrift Light" w:hAnsi="Bahnschrift Light"/>
+              </w:rPr>
+            </w:pPr>
+            <w:r>
+              <w:rPr>
+                <w:rFonts w:ascii="Bahnschrift Light" w:hAnsi="Bahnschrift Light"/>
+              </w:rPr>
+              <w:t>        int harga = 0;</w:t>
+            </w:r>
+          </w:p>
+          <w:p>
+            <w:pPr>
+              <w:rPr>
+                <w:rFonts w:ascii="Bahnschrift Light" w:hAnsi="Bahnschrift Light"/>
+              </w:rPr>
+            </w:pPr>
+          </w:p>
+          <w:p>
+            <w:pPr>
+              <w:rPr>
+                <w:rFonts w:ascii="Bahnschrift Light" w:hAnsi="Bahnschrift Light"/>
+              </w:rPr>
+            </w:pPr>
+            <w:r>
+              <w:rPr>
+                <w:rFonts w:ascii="Bahnschrift Light" w:hAnsi="Bahnschrift Light"/>
+              </w:rPr>
+              <w:t>        if (ukuran &gt;= 36) {</w:t>
+            </w:r>
+          </w:p>
+          <w:p>
+            <w:pPr>
+              <w:rPr>
+                <w:rFonts w:ascii="Bahnschrift Light" w:hAnsi="Bahnschrift Light"/>
+              </w:rPr>
+            </w:pPr>
+            <w:r>
+              <w:rPr>
+                <w:rFonts w:ascii="Bahnschrift Light" w:hAnsi="Bahnschrift Light"/>
+              </w:rPr>
+              <w:t>            if (ukuran &lt;= 44) {</w:t>
+            </w:r>
+          </w:p>
+          <w:p>
+            <w:pPr>
+              <w:rPr>
+                <w:rFonts w:ascii="Bahnschrift Light" w:hAnsi="Bahnschrift Light"/>
+              </w:rPr>
+            </w:pPr>
+          </w:p>
+          <w:p>
+            <w:pPr>
+              <w:rPr>
+                <w:rFonts w:ascii="Bahnschrift Light" w:hAnsi="Bahnschrift Light"/>
+              </w:rPr>
+            </w:pPr>
+            <w:r>
+              <w:rPr>
+                <w:rFonts w:ascii="Bahnschrift Light" w:hAnsi="Bahnschrift Light"/>
+              </w:rPr>
+              <w:t>                if (merk.equals("Converse")) {</w:t>
+            </w:r>
+          </w:p>
+          <w:p>
+            <w:pPr>
+              <w:rPr>
+                <w:rFonts w:ascii="Bahnschrift Light" w:hAnsi="Bahnschrift Light"/>
+              </w:rPr>
+            </w:pPr>
+            <w:r>
+              <w:rPr>
+                <w:rFonts w:ascii="Bahnschrift Light" w:hAnsi="Bahnschrift Light"/>
+              </w:rPr>
+              <w:t>                    if (kategori.equals("Slip On")) {</w:t>
+            </w:r>
+          </w:p>
+          <w:p>
+            <w:pPr>
+              <w:rPr>
+                <w:rFonts w:ascii="Bahnschrift Light" w:hAnsi="Bahnschrift Light"/>
+              </w:rPr>
+            </w:pPr>
+            <w:r>
+              <w:rPr>
+                <w:rFonts w:ascii="Bahnschrift Light" w:hAnsi="Bahnschrift Light"/>
+              </w:rPr>
+              <w:t>                        if (ukuran &lt;= 40) {</w:t>
+            </w:r>
+          </w:p>
+          <w:p>
+            <w:pPr>
+              <w:rPr>
+                <w:rFonts w:ascii="Bahnschrift Light" w:hAnsi="Bahnschrift Light"/>
+              </w:rPr>
+            </w:pPr>
+            <w:r>
+              <w:rPr>
+                <w:rFonts w:ascii="Bahnschrift Light" w:hAnsi="Bahnschrift Light"/>
+              </w:rPr>
+              <w:t>                            harga = 800000;</w:t>
             </w:r>
           </w:p>
           <w:p>
@@ -3058,48 +1614,20 @@
               <w:rPr>
                 <w:rFonts w:ascii="Bahnschrift Light" w:hAnsi="Bahnschrift Light"/>
               </w:rPr>
-              <w:t>                        if (</w:t>
-            </w:r>
-            <w:proofErr w:type="spellStart"/>
-            <w:r>
-              <w:rPr>
-                <w:rFonts w:ascii="Bahnschrift Light" w:hAnsi="Bahnschrift Light"/>
-              </w:rPr>
-              <w:t>ukuran</w:t>
-            </w:r>
-            <w:proofErr w:type="spellEnd"/>
-            <w:r>
-              <w:rPr>
-                <w:rFonts w:ascii="Bahnschrift Light" w:hAnsi="Bahnschrift Light"/>
-              </w:rPr>
-              <w:t xml:space="preserve"> &gt;= 40) {</w:t>
-            </w:r>
-          </w:p>
-          <w:p>
-            <w:pPr>
-              <w:rPr>
-                <w:rFonts w:ascii="Bahnschrift Light" w:hAnsi="Bahnschrift Light"/>
-              </w:rPr>
-            </w:pPr>
-            <w:r>
-              <w:rPr>
-                <w:rFonts w:ascii="Bahnschrift Light" w:hAnsi="Bahnschrift Light"/>
-              </w:rPr>
-              <w:t xml:space="preserve">                            </w:t>
-            </w:r>
-            <w:proofErr w:type="spellStart"/>
-            <w:r>
-              <w:rPr>
-                <w:rFonts w:ascii="Bahnschrift Light" w:hAnsi="Bahnschrift Light"/>
-              </w:rPr>
-              <w:t>harga</w:t>
-            </w:r>
-            <w:proofErr w:type="spellEnd"/>
-            <w:r>
-              <w:rPr>
-                <w:rFonts w:ascii="Bahnschrift Light" w:hAnsi="Bahnschrift Light"/>
-              </w:rPr>
-              <w:t xml:space="preserve"> = 1200000;</w:t>
+              <w:t>                        if (ukuran &gt;= 40) {</w:t>
+            </w:r>
+          </w:p>
+          <w:p>
+            <w:pPr>
+              <w:rPr>
+                <w:rFonts w:ascii="Bahnschrift Light" w:hAnsi="Bahnschrift Light"/>
+              </w:rPr>
+            </w:pPr>
+            <w:r>
+              <w:rPr>
+                <w:rFonts w:ascii="Bahnschrift Light" w:hAnsi="Bahnschrift Light"/>
+              </w:rPr>
+              <w:t>                            harga = 1200000;</w:t>
             </w:r>
           </w:p>
           <w:p>
@@ -3151,106 +1679,46 @@
               <w:rPr>
                 <w:rFonts w:ascii="Bahnschrift Light" w:hAnsi="Bahnschrift Light"/>
               </w:rPr>
-              <w:t>                    if (</w:t>
-            </w:r>
-            <w:proofErr w:type="spellStart"/>
-            <w:proofErr w:type="gramStart"/>
-            <w:r>
-              <w:rPr>
-                <w:rFonts w:ascii="Bahnschrift Light" w:hAnsi="Bahnschrift Light"/>
-              </w:rPr>
-              <w:t>merk.equals</w:t>
-            </w:r>
-            <w:proofErr w:type="spellEnd"/>
-            <w:proofErr w:type="gramEnd"/>
-            <w:r>
-              <w:rPr>
-                <w:rFonts w:ascii="Bahnschrift Light" w:hAnsi="Bahnschrift Light"/>
-              </w:rPr>
-              <w:t>("Sketcher")) {</w:t>
-            </w:r>
-          </w:p>
-          <w:p>
-            <w:pPr>
-              <w:rPr>
-                <w:rFonts w:ascii="Bahnschrift Light" w:hAnsi="Bahnschrift Light"/>
-              </w:rPr>
-            </w:pPr>
-            <w:r>
-              <w:rPr>
-                <w:rFonts w:ascii="Bahnschrift Light" w:hAnsi="Bahnschrift Light"/>
-              </w:rPr>
-              <w:t>                        if (</w:t>
-            </w:r>
-            <w:proofErr w:type="spellStart"/>
-            <w:proofErr w:type="gramStart"/>
-            <w:r>
-              <w:rPr>
-                <w:rFonts w:ascii="Bahnschrift Light" w:hAnsi="Bahnschrift Light"/>
-              </w:rPr>
-              <w:t>kategori.equals</w:t>
-            </w:r>
-            <w:proofErr w:type="spellEnd"/>
-            <w:proofErr w:type="gramEnd"/>
-            <w:r>
-              <w:rPr>
-                <w:rFonts w:ascii="Bahnschrift Light" w:hAnsi="Bahnschrift Light"/>
-              </w:rPr>
-              <w:t>("Woman")) {</w:t>
-            </w:r>
-          </w:p>
-          <w:p>
-            <w:pPr>
-              <w:rPr>
-                <w:rFonts w:ascii="Bahnschrift Light" w:hAnsi="Bahnschrift Light"/>
-              </w:rPr>
-            </w:pPr>
-            <w:r>
-              <w:rPr>
-                <w:rFonts w:ascii="Bahnschrift Light" w:hAnsi="Bahnschrift Light"/>
-              </w:rPr>
-              <w:t>                            if (</w:t>
-            </w:r>
-            <w:proofErr w:type="spellStart"/>
-            <w:r>
-              <w:rPr>
-                <w:rFonts w:ascii="Bahnschrift Light" w:hAnsi="Bahnschrift Light"/>
-              </w:rPr>
-              <w:t>ukuran</w:t>
-            </w:r>
-            <w:proofErr w:type="spellEnd"/>
-            <w:r>
-              <w:rPr>
-                <w:rFonts w:ascii="Bahnschrift Light" w:hAnsi="Bahnschrift Light"/>
-              </w:rPr>
-              <w:t xml:space="preserve"> &lt;= 41) {</w:t>
-            </w:r>
-          </w:p>
-          <w:p>
-            <w:pPr>
-              <w:rPr>
-                <w:rFonts w:ascii="Bahnschrift Light" w:hAnsi="Bahnschrift Light"/>
-              </w:rPr>
-            </w:pPr>
-            <w:r>
-              <w:rPr>
-                <w:rFonts w:ascii="Bahnschrift Light" w:hAnsi="Bahnschrift Light"/>
-              </w:rPr>
-              <w:t xml:space="preserve">                                </w:t>
-            </w:r>
-            <w:proofErr w:type="spellStart"/>
-            <w:r>
-              <w:rPr>
-                <w:rFonts w:ascii="Bahnschrift Light" w:hAnsi="Bahnschrift Light"/>
-              </w:rPr>
-              <w:t>harga</w:t>
-            </w:r>
-            <w:proofErr w:type="spellEnd"/>
-            <w:r>
-              <w:rPr>
-                <w:rFonts w:ascii="Bahnschrift Light" w:hAnsi="Bahnschrift Light"/>
-              </w:rPr>
-              <w:t xml:space="preserve"> = 1000000;</w:t>
+              <w:t>                    if (merk.equals("Sketcher")) {</w:t>
+            </w:r>
+          </w:p>
+          <w:p>
+            <w:pPr>
+              <w:rPr>
+                <w:rFonts w:ascii="Bahnschrift Light" w:hAnsi="Bahnschrift Light"/>
+              </w:rPr>
+            </w:pPr>
+            <w:r>
+              <w:rPr>
+                <w:rFonts w:ascii="Bahnschrift Light" w:hAnsi="Bahnschrift Light"/>
+              </w:rPr>
+              <w:t>                        if (kategori.equals("Woman")) {</w:t>
+            </w:r>
+          </w:p>
+          <w:p>
+            <w:pPr>
+              <w:rPr>
+                <w:rFonts w:ascii="Bahnschrift Light" w:hAnsi="Bahnschrift Light"/>
+              </w:rPr>
+            </w:pPr>
+            <w:r>
+              <w:rPr>
+                <w:rFonts w:ascii="Bahnschrift Light" w:hAnsi="Bahnschrift Light"/>
+              </w:rPr>
+              <w:t>                            if (ukuran &lt;= 41) {</w:t>
+            </w:r>
+          </w:p>
+          <w:p>
+            <w:pPr>
+              <w:rPr>
+                <w:rFonts w:ascii="Bahnschrift Light" w:hAnsi="Bahnschrift Light"/>
+              </w:rPr>
+            </w:pPr>
+            <w:r>
+              <w:rPr>
+                <w:rFonts w:ascii="Bahnschrift Light" w:hAnsi="Bahnschrift Light"/>
+              </w:rPr>
+              <w:t>                                harga = 1000000;</w:t>
             </w:r>
           </w:p>
           <w:p>
@@ -3289,48 +1757,20 @@
               <w:rPr>
                 <w:rFonts w:ascii="Bahnschrift Light" w:hAnsi="Bahnschrift Light"/>
               </w:rPr>
-              <w:t>                            if (</w:t>
-            </w:r>
-            <w:proofErr w:type="spellStart"/>
-            <w:r>
-              <w:rPr>
-                <w:rFonts w:ascii="Bahnschrift Light" w:hAnsi="Bahnschrift Light"/>
-              </w:rPr>
-              <w:t>ukuran</w:t>
-            </w:r>
-            <w:proofErr w:type="spellEnd"/>
-            <w:r>
-              <w:rPr>
-                <w:rFonts w:ascii="Bahnschrift Light" w:hAnsi="Bahnschrift Light"/>
-              </w:rPr>
-              <w:t xml:space="preserve"> &gt;= 41) {</w:t>
-            </w:r>
-          </w:p>
-          <w:p>
-            <w:pPr>
-              <w:rPr>
-                <w:rFonts w:ascii="Bahnschrift Light" w:hAnsi="Bahnschrift Light"/>
-              </w:rPr>
-            </w:pPr>
-            <w:r>
-              <w:rPr>
-                <w:rFonts w:ascii="Bahnschrift Light" w:hAnsi="Bahnschrift Light"/>
-              </w:rPr>
-              <w:t xml:space="preserve">                                </w:t>
-            </w:r>
-            <w:proofErr w:type="spellStart"/>
-            <w:r>
-              <w:rPr>
-                <w:rFonts w:ascii="Bahnschrift Light" w:hAnsi="Bahnschrift Light"/>
-              </w:rPr>
-              <w:t>harga</w:t>
-            </w:r>
-            <w:proofErr w:type="spellEnd"/>
-            <w:r>
-              <w:rPr>
-                <w:rFonts w:ascii="Bahnschrift Light" w:hAnsi="Bahnschrift Light"/>
-              </w:rPr>
-              <w:t xml:space="preserve"> = 1800000;</w:t>
+              <w:t>                            if (ukuran &gt;= 41) {</w:t>
+            </w:r>
+          </w:p>
+          <w:p>
+            <w:pPr>
+              <w:rPr>
+                <w:rFonts w:ascii="Bahnschrift Light" w:hAnsi="Bahnschrift Light"/>
+              </w:rPr>
+            </w:pPr>
+            <w:r>
+              <w:rPr>
+                <w:rFonts w:ascii="Bahnschrift Light" w:hAnsi="Bahnschrift Light"/>
+              </w:rPr>
+              <w:t>                                harga = 1800000;</w:t>
             </w:r>
           </w:p>
           <w:p>
@@ -3382,50 +1822,20 @@
               <w:rPr>
                 <w:rFonts w:ascii="Bahnschrift Light" w:hAnsi="Bahnschrift Light"/>
               </w:rPr>
-              <w:t>                        if (</w:t>
-            </w:r>
-            <w:proofErr w:type="spellStart"/>
-            <w:proofErr w:type="gramStart"/>
-            <w:r>
-              <w:rPr>
-                <w:rFonts w:ascii="Bahnschrift Light" w:hAnsi="Bahnschrift Light"/>
-              </w:rPr>
-              <w:t>kategori.equals</w:t>
-            </w:r>
-            <w:proofErr w:type="spellEnd"/>
-            <w:proofErr w:type="gramEnd"/>
-            <w:r>
-              <w:rPr>
-                <w:rFonts w:ascii="Bahnschrift Light" w:hAnsi="Bahnschrift Light"/>
-              </w:rPr>
-              <w:t>("Kids")) {</w:t>
-            </w:r>
-          </w:p>
-          <w:p>
-            <w:pPr>
-              <w:rPr>
-                <w:rFonts w:ascii="Bahnschrift Light" w:hAnsi="Bahnschrift Light"/>
-              </w:rPr>
-            </w:pPr>
-            <w:r>
-              <w:rPr>
-                <w:rFonts w:ascii="Bahnschrift Light" w:hAnsi="Bahnschrift Light"/>
-              </w:rPr>
-              <w:t>                            if (</w:t>
-            </w:r>
-            <w:proofErr w:type="spellStart"/>
-            <w:r>
-              <w:rPr>
-                <w:rFonts w:ascii="Bahnschrift Light" w:hAnsi="Bahnschrift Light"/>
-              </w:rPr>
-              <w:t>ukuran</w:t>
-            </w:r>
-            <w:proofErr w:type="spellEnd"/>
-            <w:r>
-              <w:rPr>
-                <w:rFonts w:ascii="Bahnschrift Light" w:hAnsi="Bahnschrift Light"/>
-              </w:rPr>
-              <w:t xml:space="preserve"> &lt;= 40) {</w:t>
+              <w:t>                        if (kategori.equals("Kids")) {</w:t>
+            </w:r>
+          </w:p>
+          <w:p>
+            <w:pPr>
+              <w:rPr>
+                <w:rFonts w:ascii="Bahnschrift Light" w:hAnsi="Bahnschrift Light"/>
+              </w:rPr>
+            </w:pPr>
+            <w:r>
+              <w:rPr>
+                <w:rFonts w:ascii="Bahnschrift Light" w:hAnsi="Bahnschrift Light"/>
+              </w:rPr>
+              <w:t>                            if (ukuran &lt;= 40) {</w:t>
             </w:r>
           </w:p>
           <w:p>
@@ -3439,21 +1849,7 @@
                 <w:rFonts w:ascii="Bahnschrift Light" w:hAnsi="Bahnschrift Light"/>
               </w:rPr>
               <w:lastRenderedPageBreak/>
-              <w:t xml:space="preserve">                                </w:t>
-            </w:r>
-            <w:proofErr w:type="spellStart"/>
-            <w:r>
-              <w:rPr>
-                <w:rFonts w:ascii="Bahnschrift Light" w:hAnsi="Bahnschrift Light"/>
-              </w:rPr>
-              <w:t>harga</w:t>
-            </w:r>
-            <w:proofErr w:type="spellEnd"/>
-            <w:r>
-              <w:rPr>
-                <w:rFonts w:ascii="Bahnschrift Light" w:hAnsi="Bahnschrift Light"/>
-              </w:rPr>
-              <w:t xml:space="preserve"> = 750000;</w:t>
+              <w:t>                                harga = 750000;</w:t>
             </w:r>
           </w:p>
           <w:p>
@@ -3492,48 +1888,20 @@
               <w:rPr>
                 <w:rFonts w:ascii="Bahnschrift Light" w:hAnsi="Bahnschrift Light"/>
               </w:rPr>
-              <w:t>                            if (</w:t>
-            </w:r>
-            <w:proofErr w:type="spellStart"/>
-            <w:r>
-              <w:rPr>
-                <w:rFonts w:ascii="Bahnschrift Light" w:hAnsi="Bahnschrift Light"/>
-              </w:rPr>
-              <w:t>ukuran</w:t>
-            </w:r>
-            <w:proofErr w:type="spellEnd"/>
-            <w:r>
-              <w:rPr>
-                <w:rFonts w:ascii="Bahnschrift Light" w:hAnsi="Bahnschrift Light"/>
-              </w:rPr>
-              <w:t xml:space="preserve"> &gt;= 40) {</w:t>
-            </w:r>
-          </w:p>
-          <w:p>
-            <w:pPr>
-              <w:rPr>
-                <w:rFonts w:ascii="Bahnschrift Light" w:hAnsi="Bahnschrift Light"/>
-              </w:rPr>
-            </w:pPr>
-            <w:r>
-              <w:rPr>
-                <w:rFonts w:ascii="Bahnschrift Light" w:hAnsi="Bahnschrift Light"/>
-              </w:rPr>
-              <w:t xml:space="preserve">                                </w:t>
-            </w:r>
-            <w:proofErr w:type="spellStart"/>
-            <w:r>
-              <w:rPr>
-                <w:rFonts w:ascii="Bahnschrift Light" w:hAnsi="Bahnschrift Light"/>
-              </w:rPr>
-              <w:t>harga</w:t>
-            </w:r>
-            <w:proofErr w:type="spellEnd"/>
-            <w:r>
-              <w:rPr>
-                <w:rFonts w:ascii="Bahnschrift Light" w:hAnsi="Bahnschrift Light"/>
-              </w:rPr>
-              <w:t xml:space="preserve"> = 1500000;</w:t>
+              <w:t>                            if (ukuran &gt;= 40) {</w:t>
+            </w:r>
+          </w:p>
+          <w:p>
+            <w:pPr>
+              <w:rPr>
+                <w:rFonts w:ascii="Bahnschrift Light" w:hAnsi="Bahnschrift Light"/>
+              </w:rPr>
+            </w:pPr>
+            <w:r>
+              <w:rPr>
+                <w:rFonts w:ascii="Bahnschrift Light" w:hAnsi="Bahnschrift Light"/>
+              </w:rPr>
+              <w:t>                                harga = 1500000;</w:t>
             </w:r>
           </w:p>
           <w:p>
@@ -3605,76 +1973,20 @@
               <w:rPr>
                 <w:rFonts w:ascii="Bahnschrift Light" w:hAnsi="Bahnschrift Light"/>
               </w:rPr>
-              <w:t>                if (</w:t>
-            </w:r>
-            <w:proofErr w:type="spellStart"/>
-            <w:r>
-              <w:rPr>
-                <w:rFonts w:ascii="Bahnschrift Light" w:hAnsi="Bahnschrift Light"/>
-              </w:rPr>
-              <w:t>harga</w:t>
-            </w:r>
-            <w:proofErr w:type="spellEnd"/>
-            <w:r>
-              <w:rPr>
-                <w:rFonts w:ascii="Bahnschrift Light" w:hAnsi="Bahnschrift Light"/>
-              </w:rPr>
-              <w:t xml:space="preserve"> == 0) {</w:t>
-            </w:r>
-          </w:p>
-          <w:p>
-            <w:pPr>
-              <w:rPr>
-                <w:rFonts w:ascii="Bahnschrift Light" w:hAnsi="Bahnschrift Light"/>
-              </w:rPr>
-            </w:pPr>
-            <w:r>
-              <w:rPr>
-                <w:rFonts w:ascii="Bahnschrift Light" w:hAnsi="Bahnschrift Light"/>
-              </w:rPr>
-              <w:t xml:space="preserve">                    </w:t>
-            </w:r>
-            <w:proofErr w:type="spellStart"/>
-            <w:r>
-              <w:rPr>
-                <w:rFonts w:ascii="Bahnschrift Light" w:hAnsi="Bahnschrift Light"/>
-              </w:rPr>
-              <w:t>System.out.println</w:t>
-            </w:r>
-            <w:proofErr w:type="spellEnd"/>
-            <w:r>
-              <w:rPr>
-                <w:rFonts w:ascii="Bahnschrift Light" w:hAnsi="Bahnschrift Light"/>
-              </w:rPr>
-              <w:t xml:space="preserve">("Data </w:t>
-            </w:r>
-            <w:proofErr w:type="spellStart"/>
-            <w:r>
-              <w:rPr>
-                <w:rFonts w:ascii="Bahnschrift Light" w:hAnsi="Bahnschrift Light"/>
-              </w:rPr>
-              <w:t>tidak</w:t>
-            </w:r>
-            <w:proofErr w:type="spellEnd"/>
-            <w:r>
-              <w:rPr>
-                <w:rFonts w:ascii="Bahnschrift Light" w:hAnsi="Bahnschrift Light"/>
-              </w:rPr>
-              <w:t xml:space="preserve"> </w:t>
-            </w:r>
-            <w:proofErr w:type="spellStart"/>
-            <w:r>
-              <w:rPr>
-                <w:rFonts w:ascii="Bahnschrift Light" w:hAnsi="Bahnschrift Light"/>
-              </w:rPr>
-              <w:t>sesuai</w:t>
-            </w:r>
-            <w:proofErr w:type="spellEnd"/>
-            <w:r>
-              <w:rPr>
-                <w:rFonts w:ascii="Bahnschrift Light" w:hAnsi="Bahnschrift Light"/>
-              </w:rPr>
-              <w:t>");</w:t>
+              <w:t>                if (harga == 0) {</w:t>
+            </w:r>
+          </w:p>
+          <w:p>
+            <w:pPr>
+              <w:rPr>
+                <w:rFonts w:ascii="Bahnschrift Light" w:hAnsi="Bahnschrift Light"/>
+              </w:rPr>
+            </w:pPr>
+            <w:r>
+              <w:rPr>
+                <w:rFonts w:ascii="Bahnschrift Light" w:hAnsi="Bahnschrift Light"/>
+              </w:rPr>
+              <w:t>                    System.out.println("Data tidak sesuai");</w:t>
             </w:r>
           </w:p>
           <w:p>
@@ -3700,57 +2012,7 @@
               <w:rPr>
                 <w:rFonts w:ascii="Bahnschrift Light" w:hAnsi="Bahnschrift Light"/>
               </w:rPr>
-              <w:t xml:space="preserve">                    </w:t>
-            </w:r>
-            <w:proofErr w:type="spellStart"/>
-            <w:r>
-              <w:rPr>
-                <w:rFonts w:ascii="Bahnschrift Light" w:hAnsi="Bahnschrift Light"/>
-              </w:rPr>
-              <w:t>System.out.println</w:t>
-            </w:r>
-            <w:proofErr w:type="spellEnd"/>
-            <w:r>
-              <w:rPr>
-                <w:rFonts w:ascii="Bahnschrift Light" w:hAnsi="Bahnschrift Light"/>
-              </w:rPr>
-              <w:t xml:space="preserve">("Harga </w:t>
-            </w:r>
-            <w:proofErr w:type="spellStart"/>
-            <w:proofErr w:type="gramStart"/>
-            <w:r>
-              <w:rPr>
-                <w:rFonts w:ascii="Bahnschrift Light" w:hAnsi="Bahnschrift Light"/>
-              </w:rPr>
-              <w:t>sepatu</w:t>
-            </w:r>
-            <w:proofErr w:type="spellEnd"/>
-            <w:r>
-              <w:rPr>
-                <w:rFonts w:ascii="Bahnschrift Light" w:hAnsi="Bahnschrift Light"/>
-              </w:rPr>
-              <w:t xml:space="preserve"> :</w:t>
-            </w:r>
-            <w:proofErr w:type="gramEnd"/>
-            <w:r>
-              <w:rPr>
-                <w:rFonts w:ascii="Bahnschrift Light" w:hAnsi="Bahnschrift Light"/>
-              </w:rPr>
-              <w:t xml:space="preserve"> Rp " + </w:t>
-            </w:r>
-            <w:proofErr w:type="spellStart"/>
-            <w:r>
-              <w:rPr>
-                <w:rFonts w:ascii="Bahnschrift Light" w:hAnsi="Bahnschrift Light"/>
-              </w:rPr>
-              <w:t>harga</w:t>
-            </w:r>
-            <w:proofErr w:type="spellEnd"/>
-            <w:r>
-              <w:rPr>
-                <w:rFonts w:ascii="Bahnschrift Light" w:hAnsi="Bahnschrift Light"/>
-              </w:rPr>
-              <w:t>);</w:t>
+              <w:t>                    System.out.println("Harga sepatu : Rp " + harga);</w:t>
             </w:r>
           </w:p>
           <w:p>
@@ -3796,63 +2058,7 @@
               <w:rPr>
                 <w:rFonts w:ascii="Bahnschrift Light" w:hAnsi="Bahnschrift Light"/>
               </w:rPr>
-              <w:t xml:space="preserve">                </w:t>
-            </w:r>
-            <w:proofErr w:type="spellStart"/>
-            <w:r>
-              <w:rPr>
-                <w:rFonts w:ascii="Bahnschrift Light" w:hAnsi="Bahnschrift Light"/>
-              </w:rPr>
-              <w:t>System.out.println</w:t>
-            </w:r>
-            <w:proofErr w:type="spellEnd"/>
-            <w:r>
-              <w:rPr>
-                <w:rFonts w:ascii="Bahnschrift Light" w:hAnsi="Bahnschrift Light"/>
-              </w:rPr>
-              <w:t>("</w:t>
-            </w:r>
-            <w:proofErr w:type="spellStart"/>
-            <w:r>
-              <w:rPr>
-                <w:rFonts w:ascii="Bahnschrift Light" w:hAnsi="Bahnschrift Light"/>
-              </w:rPr>
-              <w:t>Ukuran</w:t>
-            </w:r>
-            <w:proofErr w:type="spellEnd"/>
-            <w:r>
-              <w:rPr>
-                <w:rFonts w:ascii="Bahnschrift Light" w:hAnsi="Bahnschrift Light"/>
-              </w:rPr>
-              <w:t xml:space="preserve"> </w:t>
-            </w:r>
-            <w:proofErr w:type="spellStart"/>
-            <w:r>
-              <w:rPr>
-                <w:rFonts w:ascii="Bahnschrift Light" w:hAnsi="Bahnschrift Light"/>
-              </w:rPr>
-              <w:t>tidak</w:t>
-            </w:r>
-            <w:proofErr w:type="spellEnd"/>
-            <w:r>
-              <w:rPr>
-                <w:rFonts w:ascii="Bahnschrift Light" w:hAnsi="Bahnschrift Light"/>
-              </w:rPr>
-              <w:t xml:space="preserve"> </w:t>
-            </w:r>
-            <w:proofErr w:type="spellStart"/>
-            <w:r>
-              <w:rPr>
-                <w:rFonts w:ascii="Bahnschrift Light" w:hAnsi="Bahnschrift Light"/>
-              </w:rPr>
-              <w:t>tersedia</w:t>
-            </w:r>
-            <w:proofErr w:type="spellEnd"/>
-            <w:r>
-              <w:rPr>
-                <w:rFonts w:ascii="Bahnschrift Light" w:hAnsi="Bahnschrift Light"/>
-              </w:rPr>
-              <w:t>");</w:t>
+              <w:t>                System.out.println("Ukuran tidak tersedia");</w:t>
             </w:r>
           </w:p>
           <w:p>
@@ -3891,63 +2097,7 @@
               <w:rPr>
                 <w:rFonts w:ascii="Bahnschrift Light" w:hAnsi="Bahnschrift Light"/>
               </w:rPr>
-              <w:t xml:space="preserve">            </w:t>
-            </w:r>
-            <w:proofErr w:type="spellStart"/>
-            <w:r>
-              <w:rPr>
-                <w:rFonts w:ascii="Bahnschrift Light" w:hAnsi="Bahnschrift Light"/>
-              </w:rPr>
-              <w:t>System.out.println</w:t>
-            </w:r>
-            <w:proofErr w:type="spellEnd"/>
-            <w:r>
-              <w:rPr>
-                <w:rFonts w:ascii="Bahnschrift Light" w:hAnsi="Bahnschrift Light"/>
-              </w:rPr>
-              <w:t>("</w:t>
-            </w:r>
-            <w:proofErr w:type="spellStart"/>
-            <w:r>
-              <w:rPr>
-                <w:rFonts w:ascii="Bahnschrift Light" w:hAnsi="Bahnschrift Light"/>
-              </w:rPr>
-              <w:t>Ukuran</w:t>
-            </w:r>
-            <w:proofErr w:type="spellEnd"/>
-            <w:r>
-              <w:rPr>
-                <w:rFonts w:ascii="Bahnschrift Light" w:hAnsi="Bahnschrift Light"/>
-              </w:rPr>
-              <w:t xml:space="preserve"> </w:t>
-            </w:r>
-            <w:proofErr w:type="spellStart"/>
-            <w:r>
-              <w:rPr>
-                <w:rFonts w:ascii="Bahnschrift Light" w:hAnsi="Bahnschrift Light"/>
-              </w:rPr>
-              <w:t>tidak</w:t>
-            </w:r>
-            <w:proofErr w:type="spellEnd"/>
-            <w:r>
-              <w:rPr>
-                <w:rFonts w:ascii="Bahnschrift Light" w:hAnsi="Bahnschrift Light"/>
-              </w:rPr>
-              <w:t xml:space="preserve"> </w:t>
-            </w:r>
-            <w:proofErr w:type="spellStart"/>
-            <w:r>
-              <w:rPr>
-                <w:rFonts w:ascii="Bahnschrift Light" w:hAnsi="Bahnschrift Light"/>
-              </w:rPr>
-              <w:t>tersedia</w:t>
-            </w:r>
-            <w:proofErr w:type="spellEnd"/>
-            <w:r>
-              <w:rPr>
-                <w:rFonts w:ascii="Bahnschrift Light" w:hAnsi="Bahnschrift Light"/>
-              </w:rPr>
-              <w:t>");</w:t>
+              <w:t>            System.out.println("Ukuran tidak tersedia");</w:t>
             </w:r>
           </w:p>
           <w:p>
@@ -3980,23 +2130,7 @@
               <w:rPr>
                 <w:rFonts w:ascii="Bahnschrift Light" w:hAnsi="Bahnschrift Light"/>
               </w:rPr>
-              <w:t xml:space="preserve">        </w:t>
-            </w:r>
-            <w:proofErr w:type="spellStart"/>
-            <w:proofErr w:type="gramStart"/>
-            <w:r>
-              <w:rPr>
-                <w:rFonts w:ascii="Bahnschrift Light" w:hAnsi="Bahnschrift Light"/>
-              </w:rPr>
-              <w:t>sc.close</w:t>
-            </w:r>
-            <w:proofErr w:type="spellEnd"/>
-            <w:proofErr w:type="gramEnd"/>
-            <w:r>
-              <w:rPr>
-                <w:rFonts w:ascii="Bahnschrift Light" w:hAnsi="Bahnschrift Light"/>
-              </w:rPr>
-              <w:t>();</w:t>
+              <w:t>        sc.close();</w:t>
             </w:r>
           </w:p>
           <w:p>
@@ -4031,13 +2165,8 @@
     </w:tbl>
     <w:p/>
     <w:p>
-      <w:proofErr w:type="gramStart"/>
       <w:r>
-        <w:t>Pseudocode :</w:t>
-      </w:r>
-      <w:proofErr w:type="gramEnd"/>
-      <w:r>
-        <w:t xml:space="preserve"> </w:t>
+        <w:t xml:space="preserve">Pseudocode : </w:t>
       </w:r>
     </w:p>
     <w:tbl>
@@ -4061,81 +2190,29 @@
           </w:p>
           <w:p/>
           <w:p>
-            <w:proofErr w:type="spellStart"/>
-            <w:r>
-              <w:t>Deklarasi</w:t>
-            </w:r>
-            <w:proofErr w:type="spellEnd"/>
-            <w:r>
-              <w:t>:</w:t>
-            </w:r>
-          </w:p>
-          <w:p>
-            <w:r>
-              <w:t xml:space="preserve">    merk, </w:t>
-            </w:r>
-            <w:proofErr w:type="spellStart"/>
-            <w:proofErr w:type="gramStart"/>
-            <w:r>
-              <w:t>kategori</w:t>
-            </w:r>
-            <w:proofErr w:type="spellEnd"/>
-            <w:r>
-              <w:t xml:space="preserve"> :</w:t>
-            </w:r>
-            <w:proofErr w:type="gramEnd"/>
-            <w:r>
-              <w:t xml:space="preserve"> String</w:t>
-            </w:r>
-          </w:p>
-          <w:p>
-            <w:r>
-              <w:t xml:space="preserve">    </w:t>
-            </w:r>
-            <w:proofErr w:type="spellStart"/>
-            <w:r>
-              <w:t>ukuran</w:t>
-            </w:r>
-            <w:proofErr w:type="spellEnd"/>
-            <w:r>
-              <w:t xml:space="preserve">, </w:t>
-            </w:r>
-            <w:proofErr w:type="spellStart"/>
-            <w:proofErr w:type="gramStart"/>
-            <w:r>
-              <w:t>harga</w:t>
-            </w:r>
-            <w:proofErr w:type="spellEnd"/>
-            <w:r>
-              <w:t xml:space="preserve"> :</w:t>
-            </w:r>
-            <w:proofErr w:type="gramEnd"/>
-            <w:r>
-              <w:t xml:space="preserve"> Integer</w:t>
+            <w:r>
+              <w:t>Deklarasi:</w:t>
+            </w:r>
+          </w:p>
+          <w:p>
+            <w:r>
+              <w:t xml:space="preserve">    merk, kategori : String</w:t>
+            </w:r>
+          </w:p>
+          <w:p>
+            <w:r>
+              <w:t xml:space="preserve">    ukuran, harga : Integer</w:t>
             </w:r>
           </w:p>
           <w:p/>
           <w:p>
-            <w:proofErr w:type="spellStart"/>
-            <w:r>
-              <w:t>Algoritma</w:t>
-            </w:r>
-            <w:proofErr w:type="spellEnd"/>
-            <w:r>
-              <w:t>:</w:t>
-            </w:r>
-          </w:p>
-          <w:p>
-            <w:r>
-              <w:t xml:space="preserve">    Output "Merk   </w:t>
-            </w:r>
-            <w:proofErr w:type="gramStart"/>
-            <w:r>
-              <w:t xml:space="preserve">  :</w:t>
-            </w:r>
-            <w:proofErr w:type="gramEnd"/>
-            <w:r>
-              <w:t xml:space="preserve"> "</w:t>
+            <w:r>
+              <w:t>Algoritma:</w:t>
+            </w:r>
+          </w:p>
+          <w:p>
+            <w:r>
+              <w:t xml:space="preserve">    Output "Merk     : "</w:t>
             </w:r>
           </w:p>
           <w:p>
@@ -4145,146 +2222,51 @@
           </w:p>
           <w:p>
             <w:r>
-              <w:t xml:space="preserve">    merk &lt;- </w:t>
-            </w:r>
-            <w:proofErr w:type="spellStart"/>
-            <w:r>
-              <w:t>LowerCase</w:t>
-            </w:r>
-            <w:proofErr w:type="spellEnd"/>
-            <w:r>
-              <w:t>(merk)</w:t>
+              <w:t xml:space="preserve">    merk &lt;- LowerCase(merk)</w:t>
             </w:r>
           </w:p>
           <w:p/>
           <w:p>
             <w:r>
-              <w:t xml:space="preserve">    Output "</w:t>
-            </w:r>
-            <w:proofErr w:type="spellStart"/>
-            <w:proofErr w:type="gramStart"/>
-            <w:r>
-              <w:t>Kategori</w:t>
-            </w:r>
-            <w:proofErr w:type="spellEnd"/>
-            <w:r>
-              <w:t xml:space="preserve"> :</w:t>
-            </w:r>
-            <w:proofErr w:type="gramEnd"/>
-            <w:r>
-              <w:t xml:space="preserve"> "</w:t>
-            </w:r>
-          </w:p>
-          <w:p>
-            <w:r>
-              <w:t xml:space="preserve">    Input </w:t>
-            </w:r>
-            <w:proofErr w:type="spellStart"/>
-            <w:r>
-              <w:t>kategori</w:t>
-            </w:r>
-            <w:proofErr w:type="spellEnd"/>
-          </w:p>
-          <w:p>
-            <w:r>
-              <w:t xml:space="preserve">    </w:t>
-            </w:r>
-            <w:proofErr w:type="spellStart"/>
-            <w:r>
-              <w:t>kategori</w:t>
-            </w:r>
-            <w:proofErr w:type="spellEnd"/>
-            <w:r>
-              <w:t xml:space="preserve"> &lt;- </w:t>
-            </w:r>
-            <w:proofErr w:type="spellStart"/>
-            <w:r>
-              <w:t>LowerCase</w:t>
-            </w:r>
-            <w:proofErr w:type="spellEnd"/>
-            <w:r>
-              <w:t>(</w:t>
-            </w:r>
-            <w:proofErr w:type="spellStart"/>
-            <w:r>
-              <w:t>kategori</w:t>
-            </w:r>
-            <w:proofErr w:type="spellEnd"/>
-            <w:r>
-              <w:t>)</w:t>
+              <w:t xml:space="preserve">    Output "Kategori : "</w:t>
+            </w:r>
+          </w:p>
+          <w:p>
+            <w:r>
+              <w:t xml:space="preserve">    Input kategori</w:t>
+            </w:r>
+          </w:p>
+          <w:p>
+            <w:r>
+              <w:t xml:space="preserve">    kategori &lt;- LowerCase(kategori)</w:t>
             </w:r>
           </w:p>
           <w:p/>
           <w:p>
             <w:r>
-              <w:t xml:space="preserve">    Output "</w:t>
-            </w:r>
-            <w:proofErr w:type="spellStart"/>
-            <w:r>
-              <w:t>Ukuran</w:t>
-            </w:r>
-            <w:proofErr w:type="spellEnd"/>
-            <w:r>
-              <w:t xml:space="preserve"> </w:t>
-            </w:r>
-            <w:proofErr w:type="gramStart"/>
-            <w:r>
-              <w:t xml:space="preserve">  :</w:t>
-            </w:r>
-            <w:proofErr w:type="gramEnd"/>
-            <w:r>
-              <w:t xml:space="preserve"> "</w:t>
-            </w:r>
-          </w:p>
-          <w:p>
-            <w:r>
-              <w:t xml:space="preserve">    Input </w:t>
-            </w:r>
-            <w:proofErr w:type="spellStart"/>
-            <w:r>
-              <w:t>ukuran</w:t>
-            </w:r>
-            <w:proofErr w:type="spellEnd"/>
+              <w:t xml:space="preserve">    Output "Ukuran   : "</w:t>
+            </w:r>
+          </w:p>
+          <w:p>
+            <w:r>
+              <w:t xml:space="preserve">    Input ukuran</w:t>
+            </w:r>
           </w:p>
           <w:p/>
           <w:p>
             <w:r>
-              <w:t xml:space="preserve">    </w:t>
-            </w:r>
-            <w:proofErr w:type="spellStart"/>
-            <w:r>
-              <w:t>harga</w:t>
-            </w:r>
-            <w:proofErr w:type="spellEnd"/>
-            <w:r>
-              <w:t xml:space="preserve"> &lt;- 0</w:t>
+              <w:t xml:space="preserve">    harga &lt;- 0</w:t>
             </w:r>
           </w:p>
           <w:p/>
           <w:p>
             <w:r>
-              <w:t xml:space="preserve">    IF </w:t>
-            </w:r>
-            <w:proofErr w:type="spellStart"/>
-            <w:r>
-              <w:t>ukuran</w:t>
-            </w:r>
-            <w:proofErr w:type="spellEnd"/>
-            <w:r>
-              <w:t xml:space="preserve"> &gt;= 36 THEN</w:t>
-            </w:r>
-          </w:p>
-          <w:p>
-            <w:r>
-              <w:t xml:space="preserve">        IF </w:t>
-            </w:r>
-            <w:proofErr w:type="spellStart"/>
-            <w:r>
-              <w:t>ukuran</w:t>
-            </w:r>
-            <w:proofErr w:type="spellEnd"/>
-            <w:r>
-              <w:t xml:space="preserve"> &lt;= 44 THEN</w:t>
+              <w:t xml:space="preserve">    IF ukuran &gt;= 36 THEN</w:t>
+            </w:r>
+          </w:p>
+          <w:p>
+            <w:r>
+              <w:t xml:space="preserve">        IF ukuran &lt;= 44 THEN</w:t>
             </w:r>
           </w:p>
           <w:p/>
@@ -4295,41 +2277,17 @@
           </w:p>
           <w:p>
             <w:r>
-              <w:t xml:space="preserve">                IF </w:t>
-            </w:r>
-            <w:proofErr w:type="spellStart"/>
-            <w:r>
-              <w:t>kategori</w:t>
-            </w:r>
-            <w:proofErr w:type="spellEnd"/>
-            <w:r>
-              <w:t xml:space="preserve"> = "slip on" THEN</w:t>
-            </w:r>
-          </w:p>
-          <w:p>
-            <w:r>
-              <w:t xml:space="preserve">                    IF </w:t>
-            </w:r>
-            <w:proofErr w:type="spellStart"/>
-            <w:r>
-              <w:t>ukuran</w:t>
-            </w:r>
-            <w:proofErr w:type="spellEnd"/>
-            <w:r>
-              <w:t xml:space="preserve"> &lt;= 40 THEN</w:t>
-            </w:r>
-          </w:p>
-          <w:p>
-            <w:r>
-              <w:t xml:space="preserve">                        </w:t>
-            </w:r>
-            <w:proofErr w:type="spellStart"/>
-            <w:r>
-              <w:t>harga</w:t>
-            </w:r>
-            <w:proofErr w:type="spellEnd"/>
-            <w:r>
-              <w:t xml:space="preserve"> &lt;- 800000</w:t>
+              <w:t xml:space="preserve">                IF kategori = "slip on" THEN</w:t>
+            </w:r>
+          </w:p>
+          <w:p>
+            <w:r>
+              <w:t xml:space="preserve">                    IF ukuran &lt;= 40 THEN</w:t>
+            </w:r>
+          </w:p>
+          <w:p>
+            <w:r>
+              <w:t xml:space="preserve">                        harga &lt;- 800000</w:t>
             </w:r>
           </w:p>
           <w:p>
@@ -4344,28 +2302,12 @@
           </w:p>
           <w:p>
             <w:r>
-              <w:t xml:space="preserve">                    IF </w:t>
-            </w:r>
-            <w:proofErr w:type="spellStart"/>
-            <w:r>
-              <w:t>ukuran</w:t>
-            </w:r>
-            <w:proofErr w:type="spellEnd"/>
-            <w:r>
-              <w:t xml:space="preserve"> &gt;= 40 THEN</w:t>
-            </w:r>
-          </w:p>
-          <w:p>
-            <w:r>
-              <w:t xml:space="preserve">                        </w:t>
-            </w:r>
-            <w:proofErr w:type="spellStart"/>
-            <w:r>
-              <w:t>harga</w:t>
-            </w:r>
-            <w:proofErr w:type="spellEnd"/>
-            <w:r>
-              <w:t xml:space="preserve"> &lt;- 1200000</w:t>
+              <w:t xml:space="preserve">                    IF ukuran &gt;= 40 THEN</w:t>
+            </w:r>
+          </w:p>
+          <w:p>
+            <w:r>
+              <w:t xml:space="preserve">                        harga &lt;- 1200000</w:t>
             </w:r>
           </w:p>
           <w:p>
@@ -4390,41 +2332,17 @@
           </w:p>
           <w:p>
             <w:r>
-              <w:t xml:space="preserve">                    IF </w:t>
-            </w:r>
-            <w:proofErr w:type="spellStart"/>
-            <w:r>
-              <w:t>kategori</w:t>
-            </w:r>
-            <w:proofErr w:type="spellEnd"/>
-            <w:r>
-              <w:t xml:space="preserve"> = "woman" THEN</w:t>
-            </w:r>
-          </w:p>
-          <w:p>
-            <w:r>
-              <w:t xml:space="preserve">                        IF </w:t>
-            </w:r>
-            <w:proofErr w:type="spellStart"/>
-            <w:r>
-              <w:t>ukuran</w:t>
-            </w:r>
-            <w:proofErr w:type="spellEnd"/>
-            <w:r>
-              <w:t xml:space="preserve"> &lt;= 41 THEN</w:t>
-            </w:r>
-          </w:p>
-          <w:p>
-            <w:r>
-              <w:t xml:space="preserve">                            </w:t>
-            </w:r>
-            <w:proofErr w:type="spellStart"/>
-            <w:r>
-              <w:t>harga</w:t>
-            </w:r>
-            <w:proofErr w:type="spellEnd"/>
-            <w:r>
-              <w:t xml:space="preserve"> &lt;- 1000000</w:t>
+              <w:t xml:space="preserve">                    IF kategori = "woman" THEN</w:t>
+            </w:r>
+          </w:p>
+          <w:p>
+            <w:r>
+              <w:t xml:space="preserve">                        IF ukuran &lt;= 41 THEN</w:t>
+            </w:r>
+          </w:p>
+          <w:p>
+            <w:r>
+              <w:t xml:space="preserve">                            harga &lt;- 1000000</w:t>
             </w:r>
           </w:p>
           <w:p>
@@ -4439,28 +2357,12 @@
           </w:p>
           <w:p>
             <w:r>
-              <w:t xml:space="preserve">                        IF </w:t>
-            </w:r>
-            <w:proofErr w:type="spellStart"/>
-            <w:r>
-              <w:t>ukuran</w:t>
-            </w:r>
-            <w:proofErr w:type="spellEnd"/>
-            <w:r>
-              <w:t xml:space="preserve"> &gt;= 41 THEN</w:t>
-            </w:r>
-          </w:p>
-          <w:p>
-            <w:r>
-              <w:t xml:space="preserve">                            </w:t>
-            </w:r>
-            <w:proofErr w:type="spellStart"/>
-            <w:r>
-              <w:t>harga</w:t>
-            </w:r>
-            <w:proofErr w:type="spellEnd"/>
-            <w:r>
-              <w:t xml:space="preserve"> &lt;- 1800000</w:t>
+              <w:t xml:space="preserve">                        IF ukuran &gt;= 41 THEN</w:t>
+            </w:r>
+          </w:p>
+          <w:p>
+            <w:r>
+              <w:t xml:space="preserve">                            harga &lt;- 1800000</w:t>
             </w:r>
           </w:p>
           <w:p>
@@ -4480,41 +2382,17 @@
           </w:p>
           <w:p>
             <w:r>
-              <w:t xml:space="preserve">                    IF </w:t>
-            </w:r>
-            <w:proofErr w:type="spellStart"/>
-            <w:r>
-              <w:t>kategori</w:t>
-            </w:r>
-            <w:proofErr w:type="spellEnd"/>
-            <w:r>
-              <w:t xml:space="preserve"> = "kids" THEN</w:t>
-            </w:r>
-          </w:p>
-          <w:p>
-            <w:r>
-              <w:t xml:space="preserve">                        IF </w:t>
-            </w:r>
-            <w:proofErr w:type="spellStart"/>
-            <w:r>
-              <w:t>ukuran</w:t>
-            </w:r>
-            <w:proofErr w:type="spellEnd"/>
-            <w:r>
-              <w:t xml:space="preserve"> &lt;= 40 THEN</w:t>
-            </w:r>
-          </w:p>
-          <w:p>
-            <w:r>
-              <w:t xml:space="preserve">                            </w:t>
-            </w:r>
-            <w:proofErr w:type="spellStart"/>
-            <w:r>
-              <w:t>harga</w:t>
-            </w:r>
-            <w:proofErr w:type="spellEnd"/>
-            <w:r>
-              <w:t xml:space="preserve"> &lt;- 750000</w:t>
+              <w:t xml:space="preserve">                    IF kategori = "kids" THEN</w:t>
+            </w:r>
+          </w:p>
+          <w:p>
+            <w:r>
+              <w:t xml:space="preserve">                        IF ukuran &lt;= 40 THEN</w:t>
+            </w:r>
+          </w:p>
+          <w:p>
+            <w:r>
+              <w:t xml:space="preserve">                            harga &lt;- 750000</w:t>
             </w:r>
           </w:p>
           <w:p>
@@ -4529,28 +2407,12 @@
           </w:p>
           <w:p>
             <w:r>
-              <w:t xml:space="preserve">                        IF </w:t>
-            </w:r>
-            <w:proofErr w:type="spellStart"/>
-            <w:r>
-              <w:t>ukuran</w:t>
-            </w:r>
-            <w:proofErr w:type="spellEnd"/>
-            <w:r>
-              <w:t xml:space="preserve"> &gt;= 40 THEN</w:t>
-            </w:r>
-          </w:p>
-          <w:p>
-            <w:r>
-              <w:t xml:space="preserve">                            </w:t>
-            </w:r>
-            <w:proofErr w:type="spellStart"/>
-            <w:r>
-              <w:t>harga</w:t>
-            </w:r>
-            <w:proofErr w:type="spellEnd"/>
-            <w:r>
-              <w:t xml:space="preserve"> &lt;- 1500000</w:t>
+              <w:t xml:space="preserve">                        IF ukuran &gt;= 40 THEN</w:t>
+            </w:r>
+          </w:p>
+          <w:p>
+            <w:r>
+              <w:t xml:space="preserve">                            harga &lt;- 1500000</w:t>
             </w:r>
           </w:p>
           <w:p>
@@ -4576,37 +2438,13 @@
           <w:p/>
           <w:p>
             <w:r>
-              <w:t xml:space="preserve">            IF </w:t>
-            </w:r>
-            <w:proofErr w:type="spellStart"/>
-            <w:r>
-              <w:t>harga</w:t>
-            </w:r>
-            <w:proofErr w:type="spellEnd"/>
-            <w:r>
-              <w:t xml:space="preserve"> = 0 THEN</w:t>
+              <w:t xml:space="preserve">            IF harga = 0 THEN</w:t>
             </w:r>
           </w:p>
           <w:p>
             <w:r>
               <w:lastRenderedPageBreak/>
-              <w:t xml:space="preserve">                Output "Data </w:t>
-            </w:r>
-            <w:proofErr w:type="spellStart"/>
-            <w:r>
-              <w:t>tidak</w:t>
-            </w:r>
-            <w:proofErr w:type="spellEnd"/>
-            <w:r>
-              <w:t xml:space="preserve"> </w:t>
-            </w:r>
-            <w:proofErr w:type="spellStart"/>
-            <w:r>
-              <w:t>sesuai</w:t>
-            </w:r>
-            <w:proofErr w:type="spellEnd"/>
-            <w:r>
-              <w:t>"</w:t>
+              <w:t xml:space="preserve">                Output "Data tidak sesuai"</w:t>
             </w:r>
           </w:p>
           <w:p>
@@ -4616,26 +2454,8 @@
           </w:p>
           <w:p>
             <w:r>
-              <w:t xml:space="preserve">                Output "Harga </w:t>
-            </w:r>
-            <w:proofErr w:type="spellStart"/>
-            <w:proofErr w:type="gramStart"/>
-            <w:r>
-              <w:t>sepatu</w:t>
-            </w:r>
-            <w:proofErr w:type="spellEnd"/>
-            <w:r>
-              <w:t xml:space="preserve"> :</w:t>
-            </w:r>
-            <w:proofErr w:type="gramEnd"/>
-            <w:r>
-              <w:t xml:space="preserve"> Rp ", </w:t>
-            </w:r>
-            <w:proofErr w:type="spellStart"/>
-            <w:r>
-              <w:t>harga</w:t>
-            </w:r>
-            <w:proofErr w:type="spellEnd"/>
+              <w:t xml:space="preserve">                Output "Harga sepatu : Rp ", harga</w:t>
+            </w:r>
           </w:p>
           <w:p>
             <w:r>
@@ -4650,31 +2470,7 @@
           </w:p>
           <w:p>
             <w:r>
-              <w:t xml:space="preserve">            Output "</w:t>
-            </w:r>
-            <w:proofErr w:type="spellStart"/>
-            <w:r>
-              <w:t>Ukuran</w:t>
-            </w:r>
-            <w:proofErr w:type="spellEnd"/>
-            <w:r>
-              <w:t xml:space="preserve"> </w:t>
-            </w:r>
-            <w:proofErr w:type="spellStart"/>
-            <w:r>
-              <w:t>tidak</w:t>
-            </w:r>
-            <w:proofErr w:type="spellEnd"/>
-            <w:r>
-              <w:t xml:space="preserve"> </w:t>
-            </w:r>
-            <w:proofErr w:type="spellStart"/>
-            <w:r>
-              <w:t>tersedia</w:t>
-            </w:r>
-            <w:proofErr w:type="spellEnd"/>
-            <w:r>
-              <w:t>"</w:t>
+              <w:t xml:space="preserve">            Output "Ukuran tidak tersedia"</w:t>
             </w:r>
           </w:p>
           <w:p>
@@ -4689,31 +2485,7 @@
           </w:p>
           <w:p>
             <w:r>
-              <w:t xml:space="preserve">        Output "</w:t>
-            </w:r>
-            <w:proofErr w:type="spellStart"/>
-            <w:r>
-              <w:t>Ukuran</w:t>
-            </w:r>
-            <w:proofErr w:type="spellEnd"/>
-            <w:r>
-              <w:t xml:space="preserve"> </w:t>
-            </w:r>
-            <w:proofErr w:type="spellStart"/>
-            <w:r>
-              <w:t>tidak</w:t>
-            </w:r>
-            <w:proofErr w:type="spellEnd"/>
-            <w:r>
-              <w:t xml:space="preserve"> </w:t>
-            </w:r>
-            <w:proofErr w:type="spellStart"/>
-            <w:r>
-              <w:t>tersedia</w:t>
-            </w:r>
-            <w:proofErr w:type="spellEnd"/>
-            <w:r>
-              <w:t>"</w:t>
+              <w:t xml:space="preserve">        Output "Ukuran tidak tersedia"</w:t>
             </w:r>
           </w:p>
           <w:p>
@@ -4745,19 +2517,17 @@
     <w:p/>
     <w:p/>
     <w:p>
-      <w:proofErr w:type="gramStart"/>
       <w:r>
         <w:t>Flowchart :</w:t>
       </w:r>
-      <w:proofErr w:type="gramEnd"/>
     </w:p>
     <w:p>
       <w:r>
         <w:drawing>
-          <wp:inline distT="0" distB="0" distL="0" distR="0" wp14:anchorId="2A86F3A2" wp14:editId="3DA85993">
+          <wp:inline distT="0" distB="0" distL="0" distR="0" wp14:anchorId="5DAADF0C" wp14:editId="17C2DF4C">
             <wp:extent cx="5943600" cy="7207250"/>
             <wp:effectExtent l="0" t="0" r="0" b="0"/>
-            <wp:docPr id="1322436459" name="Picture 1"/>
+            <wp:docPr id="1331673591" name="Picture 1"/>
             <wp:cNvGraphicFramePr>
               <a:graphicFrameLocks xmlns:a="http://schemas.openxmlformats.org/drawingml/2006/main" noChangeAspect="1"/>
             </wp:cNvGraphicFramePr>
@@ -4765,7 +2535,7 @@
               <a:graphicData uri="http://schemas.openxmlformats.org/drawingml/2006/picture">
                 <pic:pic xmlns:pic="http://schemas.openxmlformats.org/drawingml/2006/picture">
                   <pic:nvPicPr>
-                    <pic:cNvPr id="1322436459" name=""/>
+                    <pic:cNvPr id="1331673591" name=""/>
                     <pic:cNvPicPr/>
                   </pic:nvPicPr>
                   <pic:blipFill>
@@ -7306,6 +5076,7 @@
   <w:style w:type="character" w:default="1" w:styleId="DefaultParagraphFont">
     <w:name w:val="Default Paragraph Font"/>
     <w:uiPriority w:val="1"/>
+    <w:semiHidden/>
     <w:unhideWhenUsed/>
   </w:style>
   <w:style w:type="table" w:default="1" w:styleId="TableNormal">

</xml_diff>